<commit_message>
Day #240 - Worked on project FANG + project CRVG + finished a fiction book
</commit_message>
<xml_diff>
--- a/docs/2D_GAME_ENGINE_USING_CPP/TUTORIAL_CREATE_2D_GAME_ENGING_USING_CPP_PART_2.docx
+++ b/docs/2D_GAME_ENGINE_USING_CPP/TUTORIAL_CREATE_2D_GAME_ENGING_USING_CPP_PART_2.docx
@@ -15980,7 +15980,7 @@
           <w:noProof/>
         </w:rPr>
         <w:drawing>
-          <wp:inline distT="0" distB="0" distL="0" distR="0" wp14:anchorId="236C67A0" wp14:editId="7089983F">
+          <wp:inline distT="0" distB="0" distL="0" distR="0" wp14:anchorId="236C67A0" wp14:editId="1F4BC67B">
             <wp:extent cx="3541889" cy="1976869"/>
             <wp:effectExtent l="0" t="0" r="1905" b="4445"/>
             <wp:docPr id="1201104044" name="Picture 1" descr="A screenshot of a computer&#10;&#10;AI-generated content may be incorrect."/>
@@ -19654,7 +19654,21 @@
     </w:p>
     <w:p>
       <w:r>
-        <w:t>In this video we will add state information to our Warrior class. The two key states are:</w:t>
+        <w:t>In this video we will add state information to our Warrior class</w:t>
+      </w:r>
+      <w:r>
+        <w:t xml:space="preserve"> and jumping capability</w:t>
+      </w:r>
+      <w:r>
+        <w:t xml:space="preserve">. </w:t>
+      </w:r>
+      <w:r>
+        <w:t>We will change the animation of the player while he is jumping and falling.</w:t>
+      </w:r>
+    </w:p>
+    <w:p>
+      <w:r>
+        <w:t>The two key states are:</w:t>
       </w:r>
     </w:p>
     <w:p>
@@ -21209,6 +21223,7 @@
           <w:sz w:val="17"/>
           <w:szCs w:val="17"/>
         </w:rPr>
+        <w:lastRenderedPageBreak/>
         <w:t xml:space="preserve">17. </w:t>
       </w:r>
       <w:r>
@@ -21618,7 +21633,6 @@
           <w:sz w:val="17"/>
           <w:szCs w:val="17"/>
         </w:rPr>
-        <w:lastRenderedPageBreak/>
         <w:t xml:space="preserve">21. </w:t>
       </w:r>
       <w:r>
@@ -21788,13 +21802,15 @@
           <w:rFonts w:ascii="Consolas" w:hAnsi="Consolas" w:cs="Courier New"/>
           <w:sz w:val="17"/>
           <w:szCs w:val="17"/>
-        </w:rPr>
-      </w:pPr>
-      <w:r>
-        <w:rPr>
-          <w:rFonts w:ascii="Consolas" w:hAnsi="Consolas" w:cs="Courier New"/>
-          <w:sz w:val="17"/>
-          <w:szCs w:val="17"/>
+          <w:highlight w:val="yellow"/>
+        </w:rPr>
+      </w:pPr>
+      <w:r>
+        <w:rPr>
+          <w:rFonts w:ascii="Consolas" w:hAnsi="Consolas" w:cs="Courier New"/>
+          <w:sz w:val="17"/>
+          <w:szCs w:val="17"/>
+          <w:highlight w:val="yellow"/>
         </w:rPr>
         <w:t xml:space="preserve">24. </w:t>
       </w:r>
@@ -21804,6 +21820,7 @@
           <w:color w:val="000000"/>
           <w:sz w:val="17"/>
           <w:szCs w:val="17"/>
+          <w:highlight w:val="yellow"/>
         </w:rPr>
         <w:t xml:space="preserve">        </w:t>
       </w:r>
@@ -21813,6 +21830,7 @@
           <w:color w:val="000088"/>
           <w:sz w:val="17"/>
           <w:szCs w:val="17"/>
+          <w:highlight w:val="yellow"/>
         </w:rPr>
         <w:t>bool</w:t>
       </w:r>
@@ -21822,6 +21840,7 @@
           <w:color w:val="000000"/>
           <w:sz w:val="17"/>
           <w:szCs w:val="17"/>
+          <w:highlight w:val="yellow"/>
         </w:rPr>
         <w:t xml:space="preserve"> </w:t>
       </w:r>
@@ -21832,6 +21851,7 @@
           <w:color w:val="000000"/>
           <w:sz w:val="17"/>
           <w:szCs w:val="17"/>
+          <w:highlight w:val="yellow"/>
         </w:rPr>
         <w:t>m_</w:t>
       </w:r>
@@ -21842,6 +21862,7 @@
           <w:color w:val="000000"/>
           <w:sz w:val="17"/>
           <w:szCs w:val="17"/>
+          <w:highlight w:val="yellow"/>
         </w:rPr>
         <w:t>IsJumping</w:t>
       </w:r>
@@ -21852,6 +21873,7 @@
           <w:color w:val="666600"/>
           <w:sz w:val="17"/>
           <w:szCs w:val="17"/>
+          <w:highlight w:val="yellow"/>
         </w:rPr>
         <w:t>;</w:t>
       </w:r>
@@ -21861,6 +21883,7 @@
           <w:color w:val="000000"/>
           <w:sz w:val="17"/>
           <w:szCs w:val="17"/>
+          <w:highlight w:val="yellow"/>
         </w:rPr>
         <w:t xml:space="preserve">   </w:t>
       </w:r>
@@ -21871,6 +21894,7 @@
           <w:color w:val="880000"/>
           <w:sz w:val="17"/>
           <w:szCs w:val="17"/>
+          <w:highlight w:val="yellow"/>
         </w:rPr>
         <w:t>// indicates the player is jumping</w:t>
       </w:r>
@@ -21908,13 +21932,15 @@
           <w:rFonts w:ascii="Consolas" w:hAnsi="Consolas" w:cs="Courier New"/>
           <w:sz w:val="17"/>
           <w:szCs w:val="17"/>
-        </w:rPr>
-      </w:pPr>
-      <w:r>
-        <w:rPr>
-          <w:rFonts w:ascii="Consolas" w:hAnsi="Consolas" w:cs="Courier New"/>
-          <w:sz w:val="17"/>
-          <w:szCs w:val="17"/>
+          <w:highlight w:val="yellow"/>
+        </w:rPr>
+      </w:pPr>
+      <w:r>
+        <w:rPr>
+          <w:rFonts w:ascii="Consolas" w:hAnsi="Consolas" w:cs="Courier New"/>
+          <w:sz w:val="17"/>
+          <w:szCs w:val="17"/>
+          <w:highlight w:val="yellow"/>
         </w:rPr>
         <w:t xml:space="preserve">25. </w:t>
       </w:r>
@@ -21924,6 +21950,7 @@
           <w:color w:val="000000"/>
           <w:sz w:val="17"/>
           <w:szCs w:val="17"/>
+          <w:highlight w:val="yellow"/>
         </w:rPr>
         <w:t xml:space="preserve">        </w:t>
       </w:r>
@@ -21933,6 +21960,7 @@
           <w:color w:val="000088"/>
           <w:sz w:val="17"/>
           <w:szCs w:val="17"/>
+          <w:highlight w:val="yellow"/>
         </w:rPr>
         <w:t>bool</w:t>
       </w:r>
@@ -21942,6 +21970,7 @@
           <w:color w:val="000000"/>
           <w:sz w:val="17"/>
           <w:szCs w:val="17"/>
+          <w:highlight w:val="yellow"/>
         </w:rPr>
         <w:t xml:space="preserve"> </w:t>
       </w:r>
@@ -21952,6 +21981,7 @@
           <w:color w:val="000000"/>
           <w:sz w:val="17"/>
           <w:szCs w:val="17"/>
+          <w:highlight w:val="yellow"/>
         </w:rPr>
         <w:t>m_</w:t>
       </w:r>
@@ -21962,6 +21992,7 @@
           <w:color w:val="000000"/>
           <w:sz w:val="17"/>
           <w:szCs w:val="17"/>
+          <w:highlight w:val="yellow"/>
         </w:rPr>
         <w:t>IsGrounded</w:t>
       </w:r>
@@ -21972,6 +22003,7 @@
           <w:color w:val="666600"/>
           <w:sz w:val="17"/>
           <w:szCs w:val="17"/>
+          <w:highlight w:val="yellow"/>
         </w:rPr>
         <w:t>;</w:t>
       </w:r>
@@ -21981,6 +22013,7 @@
           <w:color w:val="000000"/>
           <w:sz w:val="17"/>
           <w:szCs w:val="17"/>
+          <w:highlight w:val="yellow"/>
         </w:rPr>
         <w:t xml:space="preserve">  </w:t>
       </w:r>
@@ -21990,6 +22023,7 @@
           <w:color w:val="880000"/>
           <w:sz w:val="17"/>
           <w:szCs w:val="17"/>
+          <w:highlight w:val="yellow"/>
         </w:rPr>
         <w:t>/</w:t>
       </w:r>
@@ -22000,6 +22034,7 @@
           <w:color w:val="880000"/>
           <w:sz w:val="17"/>
           <w:szCs w:val="17"/>
+          <w:highlight w:val="yellow"/>
         </w:rPr>
         <w:t>/ indicates the player is grounded (so player can jump)</w:t>
       </w:r>
@@ -22037,13 +22072,15 @@
           <w:rFonts w:ascii="Consolas" w:hAnsi="Consolas" w:cs="Courier New"/>
           <w:sz w:val="17"/>
           <w:szCs w:val="17"/>
-        </w:rPr>
-      </w:pPr>
-      <w:r>
-        <w:rPr>
-          <w:rFonts w:ascii="Consolas" w:hAnsi="Consolas" w:cs="Courier New"/>
-          <w:sz w:val="17"/>
-          <w:szCs w:val="17"/>
+          <w:highlight w:val="yellow"/>
+        </w:rPr>
+      </w:pPr>
+      <w:r>
+        <w:rPr>
+          <w:rFonts w:ascii="Consolas" w:hAnsi="Consolas" w:cs="Courier New"/>
+          <w:sz w:val="17"/>
+          <w:szCs w:val="17"/>
+          <w:highlight w:val="yellow"/>
         </w:rPr>
         <w:t xml:space="preserve">26. </w:t>
       </w:r>
@@ -22053,6 +22090,7 @@
           <w:color w:val="000000"/>
           <w:sz w:val="17"/>
           <w:szCs w:val="17"/>
+          <w:highlight w:val="yellow"/>
         </w:rPr>
         <w:t> </w:t>
       </w:r>
@@ -22090,13 +22128,15 @@
           <w:rFonts w:ascii="Consolas" w:hAnsi="Consolas" w:cs="Courier New"/>
           <w:sz w:val="17"/>
           <w:szCs w:val="17"/>
-        </w:rPr>
-      </w:pPr>
-      <w:r>
-        <w:rPr>
-          <w:rFonts w:ascii="Consolas" w:hAnsi="Consolas" w:cs="Courier New"/>
-          <w:sz w:val="17"/>
-          <w:szCs w:val="17"/>
+          <w:highlight w:val="yellow"/>
+        </w:rPr>
+      </w:pPr>
+      <w:r>
+        <w:rPr>
+          <w:rFonts w:ascii="Consolas" w:hAnsi="Consolas" w:cs="Courier New"/>
+          <w:sz w:val="17"/>
+          <w:szCs w:val="17"/>
+          <w:highlight w:val="yellow"/>
         </w:rPr>
         <w:t xml:space="preserve">27. </w:t>
       </w:r>
@@ -22106,6 +22146,7 @@
           <w:color w:val="000000"/>
           <w:sz w:val="17"/>
           <w:szCs w:val="17"/>
+          <w:highlight w:val="yellow"/>
         </w:rPr>
         <w:t xml:space="preserve">        </w:t>
       </w:r>
@@ -22115,6 +22156,7 @@
           <w:color w:val="000088"/>
           <w:sz w:val="17"/>
           <w:szCs w:val="17"/>
+          <w:highlight w:val="yellow"/>
         </w:rPr>
         <w:t>float</w:t>
       </w:r>
@@ -22124,6 +22166,7 @@
           <w:color w:val="000000"/>
           <w:sz w:val="17"/>
           <w:szCs w:val="17"/>
+          <w:highlight w:val="yellow"/>
         </w:rPr>
         <w:t xml:space="preserve"> </w:t>
       </w:r>
@@ -22134,6 +22177,7 @@
           <w:color w:val="000000"/>
           <w:sz w:val="17"/>
           <w:szCs w:val="17"/>
+          <w:highlight w:val="yellow"/>
         </w:rPr>
         <w:t>m_</w:t>
       </w:r>
@@ -22144,6 +22188,7 @@
           <w:color w:val="000000"/>
           <w:sz w:val="17"/>
           <w:szCs w:val="17"/>
+          <w:highlight w:val="yellow"/>
         </w:rPr>
         <w:t>JumpTime</w:t>
       </w:r>
@@ -22154,6 +22199,7 @@
           <w:color w:val="666600"/>
           <w:sz w:val="17"/>
           <w:szCs w:val="17"/>
+          <w:highlight w:val="yellow"/>
         </w:rPr>
         <w:t>;</w:t>
       </w:r>
@@ -22163,6 +22209,7 @@
           <w:color w:val="000000"/>
           <w:sz w:val="17"/>
           <w:szCs w:val="17"/>
+          <w:highlight w:val="yellow"/>
         </w:rPr>
         <w:t xml:space="preserve">   </w:t>
       </w:r>
@@ -22173,6 +22220,7 @@
           <w:color w:val="880000"/>
           <w:sz w:val="17"/>
           <w:szCs w:val="17"/>
+          <w:highlight w:val="yellow"/>
         </w:rPr>
         <w:t>/</w:t>
       </w:r>
@@ -22183,6 +22231,7 @@
           <w:color w:val="880000"/>
           <w:sz w:val="17"/>
           <w:szCs w:val="17"/>
+          <w:highlight w:val="yellow"/>
         </w:rPr>
         <w:t>/ ?</w:t>
       </w:r>
@@ -22221,13 +22270,15 @@
           <w:rFonts w:ascii="Consolas" w:hAnsi="Consolas" w:cs="Courier New"/>
           <w:sz w:val="17"/>
           <w:szCs w:val="17"/>
-        </w:rPr>
-      </w:pPr>
-      <w:r>
-        <w:rPr>
-          <w:rFonts w:ascii="Consolas" w:hAnsi="Consolas" w:cs="Courier New"/>
-          <w:sz w:val="17"/>
-          <w:szCs w:val="17"/>
+          <w:highlight w:val="yellow"/>
+        </w:rPr>
+      </w:pPr>
+      <w:r>
+        <w:rPr>
+          <w:rFonts w:ascii="Consolas" w:hAnsi="Consolas" w:cs="Courier New"/>
+          <w:sz w:val="17"/>
+          <w:szCs w:val="17"/>
+          <w:highlight w:val="yellow"/>
         </w:rPr>
         <w:t xml:space="preserve">28. </w:t>
       </w:r>
@@ -22237,6 +22288,7 @@
           <w:color w:val="000000"/>
           <w:sz w:val="17"/>
           <w:szCs w:val="17"/>
+          <w:highlight w:val="yellow"/>
         </w:rPr>
         <w:t xml:space="preserve">        </w:t>
       </w:r>
@@ -22246,6 +22298,7 @@
           <w:color w:val="000088"/>
           <w:sz w:val="17"/>
           <w:szCs w:val="17"/>
+          <w:highlight w:val="yellow"/>
         </w:rPr>
         <w:t>float</w:t>
       </w:r>
@@ -22255,6 +22308,7 @@
           <w:color w:val="000000"/>
           <w:sz w:val="17"/>
           <w:szCs w:val="17"/>
+          <w:highlight w:val="yellow"/>
         </w:rPr>
         <w:t xml:space="preserve"> </w:t>
       </w:r>
@@ -22265,6 +22319,7 @@
           <w:color w:val="000000"/>
           <w:sz w:val="17"/>
           <w:szCs w:val="17"/>
+          <w:highlight w:val="yellow"/>
         </w:rPr>
         <w:t>m_</w:t>
       </w:r>
@@ -22275,6 +22330,7 @@
           <w:color w:val="000000"/>
           <w:sz w:val="17"/>
           <w:szCs w:val="17"/>
+          <w:highlight w:val="yellow"/>
         </w:rPr>
         <w:t>JumpForce</w:t>
       </w:r>
@@ -22285,6 +22341,7 @@
           <w:color w:val="666600"/>
           <w:sz w:val="17"/>
           <w:szCs w:val="17"/>
+          <w:highlight w:val="yellow"/>
         </w:rPr>
         <w:t>;</w:t>
       </w:r>
@@ -22294,6 +22351,7 @@
           <w:color w:val="000000"/>
           <w:sz w:val="17"/>
           <w:szCs w:val="17"/>
+          <w:highlight w:val="yellow"/>
         </w:rPr>
         <w:t xml:space="preserve">  </w:t>
       </w:r>
@@ -22303,6 +22361,7 @@
           <w:color w:val="880000"/>
           <w:sz w:val="17"/>
           <w:szCs w:val="17"/>
+          <w:highlight w:val="yellow"/>
         </w:rPr>
         <w:t>/</w:t>
       </w:r>
@@ -22313,6 +22372,7 @@
           <w:color w:val="880000"/>
           <w:sz w:val="17"/>
           <w:szCs w:val="17"/>
+          <w:highlight w:val="yellow"/>
         </w:rPr>
         <w:t>/ the force the player uses to jump up</w:t>
       </w:r>
@@ -22350,13 +22410,15 @@
           <w:rFonts w:ascii="Consolas" w:hAnsi="Consolas" w:cs="Courier New"/>
           <w:sz w:val="17"/>
           <w:szCs w:val="17"/>
-        </w:rPr>
-      </w:pPr>
-      <w:r>
-        <w:rPr>
-          <w:rFonts w:ascii="Consolas" w:hAnsi="Consolas" w:cs="Courier New"/>
-          <w:sz w:val="17"/>
-          <w:szCs w:val="17"/>
+          <w:highlight w:val="yellow"/>
+        </w:rPr>
+      </w:pPr>
+      <w:r>
+        <w:rPr>
+          <w:rFonts w:ascii="Consolas" w:hAnsi="Consolas" w:cs="Courier New"/>
+          <w:sz w:val="17"/>
+          <w:szCs w:val="17"/>
+          <w:highlight w:val="yellow"/>
         </w:rPr>
         <w:t xml:space="preserve">29. </w:t>
       </w:r>
@@ -22366,6 +22428,7 @@
           <w:color w:val="000000"/>
           <w:sz w:val="17"/>
           <w:szCs w:val="17"/>
+          <w:highlight w:val="yellow"/>
         </w:rPr>
         <w:t> </w:t>
       </w:r>
@@ -22410,6 +22473,7 @@
           <w:rFonts w:ascii="Consolas" w:hAnsi="Consolas" w:cs="Courier New"/>
           <w:sz w:val="17"/>
           <w:szCs w:val="17"/>
+          <w:highlight w:val="yellow"/>
         </w:rPr>
         <w:t xml:space="preserve">30. </w:t>
       </w:r>
@@ -22419,6 +22483,7 @@
           <w:color w:val="000000"/>
           <w:sz w:val="17"/>
           <w:szCs w:val="17"/>
+          <w:highlight w:val="yellow"/>
         </w:rPr>
         <w:t xml:space="preserve">        </w:t>
       </w:r>
@@ -22428,6 +22493,7 @@
           <w:color w:val="660066"/>
           <w:sz w:val="17"/>
           <w:szCs w:val="17"/>
+          <w:highlight w:val="yellow"/>
         </w:rPr>
         <w:t>Collider</w:t>
       </w:r>
@@ -22437,6 +22503,7 @@
           <w:color w:val="666600"/>
           <w:sz w:val="17"/>
           <w:szCs w:val="17"/>
+          <w:highlight w:val="yellow"/>
         </w:rPr>
         <w:t>*</w:t>
       </w:r>
@@ -22446,6 +22513,7 @@
           <w:color w:val="000000"/>
           <w:sz w:val="17"/>
           <w:szCs w:val="17"/>
+          <w:highlight w:val="yellow"/>
         </w:rPr>
         <w:t xml:space="preserve"> </w:t>
       </w:r>
@@ -22456,6 +22524,7 @@
           <w:color w:val="000000"/>
           <w:sz w:val="17"/>
           <w:szCs w:val="17"/>
+          <w:highlight w:val="yellow"/>
         </w:rPr>
         <w:t>m_</w:t>
       </w:r>
@@ -22466,6 +22535,7 @@
           <w:color w:val="000000"/>
           <w:sz w:val="17"/>
           <w:szCs w:val="17"/>
+          <w:highlight w:val="yellow"/>
         </w:rPr>
         <w:t>Collider</w:t>
       </w:r>
@@ -22476,6 +22546,7 @@
           <w:color w:val="666600"/>
           <w:sz w:val="17"/>
           <w:szCs w:val="17"/>
+          <w:highlight w:val="yellow"/>
         </w:rPr>
         <w:t>;</w:t>
       </w:r>
@@ -22485,6 +22556,7 @@
           <w:color w:val="000000"/>
           <w:sz w:val="17"/>
           <w:szCs w:val="17"/>
+          <w:highlight w:val="yellow"/>
         </w:rPr>
         <w:t xml:space="preserve">   </w:t>
       </w:r>
@@ -22495,6 +22567,7 @@
           <w:color w:val="880000"/>
           <w:sz w:val="17"/>
           <w:szCs w:val="17"/>
+          <w:highlight w:val="yellow"/>
         </w:rPr>
         <w:t>// defines the collision box around the player</w:t>
       </w:r>
@@ -22809,13 +22882,15 @@
           <w:rFonts w:ascii="Consolas" w:hAnsi="Consolas" w:cs="Courier New"/>
           <w:sz w:val="17"/>
           <w:szCs w:val="17"/>
-        </w:rPr>
-      </w:pPr>
-      <w:r>
-        <w:rPr>
-          <w:rFonts w:ascii="Consolas" w:hAnsi="Consolas" w:cs="Courier New"/>
-          <w:sz w:val="17"/>
-          <w:szCs w:val="17"/>
+          <w:highlight w:val="yellow"/>
+        </w:rPr>
+      </w:pPr>
+      <w:r>
+        <w:rPr>
+          <w:rFonts w:ascii="Consolas" w:hAnsi="Consolas" w:cs="Courier New"/>
+          <w:sz w:val="17"/>
+          <w:szCs w:val="17"/>
+          <w:highlight w:val="yellow"/>
         </w:rPr>
         <w:t xml:space="preserve">34. </w:t>
       </w:r>
@@ -22825,6 +22900,7 @@
           <w:color w:val="000000"/>
           <w:sz w:val="17"/>
           <w:szCs w:val="17"/>
+          <w:highlight w:val="yellow"/>
         </w:rPr>
         <w:t xml:space="preserve">        </w:t>
       </w:r>
@@ -22834,6 +22910,7 @@
           <w:color w:val="880000"/>
           <w:sz w:val="17"/>
           <w:szCs w:val="17"/>
+          <w:highlight w:val="yellow"/>
         </w:rPr>
         <w:t>// if player collides with something this is the position to restore back to</w:t>
       </w:r>
@@ -22878,6 +22955,7 @@
           <w:rFonts w:ascii="Consolas" w:hAnsi="Consolas" w:cs="Courier New"/>
           <w:sz w:val="17"/>
           <w:szCs w:val="17"/>
+          <w:highlight w:val="yellow"/>
         </w:rPr>
         <w:t xml:space="preserve">35. </w:t>
       </w:r>
@@ -22887,6 +22965,7 @@
           <w:color w:val="000000"/>
           <w:sz w:val="17"/>
           <w:szCs w:val="17"/>
+          <w:highlight w:val="yellow"/>
         </w:rPr>
         <w:t xml:space="preserve">        </w:t>
       </w:r>
@@ -22896,6 +22975,7 @@
           <w:color w:val="660066"/>
           <w:sz w:val="17"/>
           <w:szCs w:val="17"/>
+          <w:highlight w:val="yellow"/>
         </w:rPr>
         <w:t>Vector2D</w:t>
       </w:r>
@@ -22905,6 +22985,7 @@
           <w:color w:val="000000"/>
           <w:sz w:val="17"/>
           <w:szCs w:val="17"/>
+          <w:highlight w:val="yellow"/>
         </w:rPr>
         <w:t xml:space="preserve"> </w:t>
       </w:r>
@@ -22915,6 +22996,7 @@
           <w:color w:val="000000"/>
           <w:sz w:val="17"/>
           <w:szCs w:val="17"/>
+          <w:highlight w:val="yellow"/>
         </w:rPr>
         <w:t>m_</w:t>
       </w:r>
@@ -22925,6 +23007,7 @@
           <w:color w:val="000000"/>
           <w:sz w:val="17"/>
           <w:szCs w:val="17"/>
+          <w:highlight w:val="yellow"/>
         </w:rPr>
         <w:t>LastSafePosition</w:t>
       </w:r>
@@ -22935,6 +23018,7 @@
           <w:color w:val="666600"/>
           <w:sz w:val="17"/>
           <w:szCs w:val="17"/>
+          <w:highlight w:val="yellow"/>
         </w:rPr>
         <w:t>;</w:t>
       </w:r>
@@ -23139,6 +23223,3549 @@
         <w:t> </w:t>
       </w:r>
     </w:p>
+    <w:p/>
+    <w:p>
+      <w:pPr>
+        <w:pStyle w:val="Heading2"/>
+      </w:pPr>
+      <w:r>
+        <w:t>Edit the Warrior.cpp</w:t>
+      </w:r>
+    </w:p>
+    <w:p>
+      <w:pPr>
+        <w:pStyle w:val="ListParagraph"/>
+        <w:numPr>
+          <w:ilvl w:val="0"/>
+          <w:numId w:val="127"/>
+        </w:numPr>
+      </w:pPr>
+      <w:r>
+        <w:t xml:space="preserve">Initialize the new member variables in the </w:t>
+      </w:r>
+      <w:proofErr w:type="gramStart"/>
+      <w:r>
+        <w:t>constructor</w:t>
+      </w:r>
+      <w:proofErr w:type="gramEnd"/>
+      <w:r>
+        <w:t>:</w:t>
+      </w:r>
+    </w:p>
+    <w:p>
+      <w:pPr>
+        <w:pStyle w:val="NormalWeb"/>
+        <w:pBdr>
+          <w:top w:val="single" w:sz="6" w:space="2" w:color="888888"/>
+          <w:left w:val="single" w:sz="6" w:space="2" w:color="888888"/>
+          <w:bottom w:val="single" w:sz="6" w:space="2" w:color="888888"/>
+          <w:right w:val="single" w:sz="6" w:space="2" w:color="888888"/>
+        </w:pBdr>
+        <w:tabs>
+          <w:tab w:val="left" w:pos="916"/>
+          <w:tab w:val="left" w:pos="1832"/>
+          <w:tab w:val="left" w:pos="2748"/>
+          <w:tab w:val="left" w:pos="3664"/>
+          <w:tab w:val="left" w:pos="4580"/>
+          <w:tab w:val="left" w:pos="5496"/>
+          <w:tab w:val="left" w:pos="6412"/>
+          <w:tab w:val="left" w:pos="7328"/>
+          <w:tab w:val="left" w:pos="8244"/>
+          <w:tab w:val="left" w:pos="9160"/>
+          <w:tab w:val="left" w:pos="10076"/>
+          <w:tab w:val="left" w:pos="10992"/>
+          <w:tab w:val="left" w:pos="11908"/>
+          <w:tab w:val="left" w:pos="12824"/>
+          <w:tab w:val="left" w:pos="13740"/>
+          <w:tab w:val="left" w:pos="14656"/>
+        </w:tabs>
+        <w:spacing w:before="0" w:beforeAutospacing="0" w:after="0" w:afterAutospacing="0"/>
+        <w:divId w:val="2018649341"/>
+        <w:rPr>
+          <w:rFonts w:ascii="Consolas" w:hAnsi="Consolas" w:cs="Courier New"/>
+          <w:sz w:val="17"/>
+          <w:szCs w:val="17"/>
+        </w:rPr>
+      </w:pPr>
+      <w:r>
+        <w:rPr>
+          <w:rFonts w:ascii="Consolas" w:hAnsi="Consolas" w:cs="Courier New"/>
+          <w:sz w:val="17"/>
+          <w:szCs w:val="17"/>
+        </w:rPr>
+        <w:t xml:space="preserve"> 1. </w:t>
+      </w:r>
+      <w:proofErr w:type="gramStart"/>
+      <w:r>
+        <w:rPr>
+          <w:rFonts w:ascii="Consolas" w:hAnsi="Consolas" w:cs="Courier New"/>
+          <w:color w:val="660066"/>
+          <w:sz w:val="17"/>
+          <w:szCs w:val="17"/>
+        </w:rPr>
+        <w:t>Warrior</w:t>
+      </w:r>
+      <w:r>
+        <w:rPr>
+          <w:rFonts w:ascii="Consolas" w:hAnsi="Consolas" w:cs="Courier New"/>
+          <w:color w:val="666600"/>
+          <w:sz w:val="17"/>
+          <w:szCs w:val="17"/>
+        </w:rPr>
+        <w:t>::</w:t>
+      </w:r>
+      <w:r>
+        <w:rPr>
+          <w:rFonts w:ascii="Consolas" w:hAnsi="Consolas" w:cs="Courier New"/>
+          <w:color w:val="660066"/>
+          <w:sz w:val="17"/>
+          <w:szCs w:val="17"/>
+        </w:rPr>
+        <w:t>Warrior</w:t>
+      </w:r>
+      <w:r>
+        <w:rPr>
+          <w:rFonts w:ascii="Consolas" w:hAnsi="Consolas" w:cs="Courier New"/>
+          <w:color w:val="666600"/>
+          <w:sz w:val="17"/>
+          <w:szCs w:val="17"/>
+        </w:rPr>
+        <w:t>(</w:t>
+      </w:r>
+      <w:proofErr w:type="gramEnd"/>
+      <w:r>
+        <w:rPr>
+          <w:rFonts w:ascii="Consolas" w:hAnsi="Consolas" w:cs="Courier New"/>
+          <w:color w:val="660066"/>
+          <w:sz w:val="17"/>
+          <w:szCs w:val="17"/>
+        </w:rPr>
+        <w:t>Properties</w:t>
+      </w:r>
+      <w:r>
+        <w:rPr>
+          <w:rFonts w:ascii="Consolas" w:hAnsi="Consolas" w:cs="Courier New"/>
+          <w:color w:val="666600"/>
+          <w:sz w:val="17"/>
+          <w:szCs w:val="17"/>
+        </w:rPr>
+        <w:t>*</w:t>
+      </w:r>
+      <w:r>
+        <w:rPr>
+          <w:rFonts w:ascii="Consolas" w:hAnsi="Consolas" w:cs="Courier New"/>
+          <w:color w:val="000000"/>
+          <w:sz w:val="17"/>
+          <w:szCs w:val="17"/>
+        </w:rPr>
+        <w:t xml:space="preserve"> props</w:t>
+      </w:r>
+      <w:r>
+        <w:rPr>
+          <w:rFonts w:ascii="Consolas" w:hAnsi="Consolas" w:cs="Courier New"/>
+          <w:color w:val="666600"/>
+          <w:sz w:val="17"/>
+          <w:szCs w:val="17"/>
+        </w:rPr>
+        <w:t>):</w:t>
+      </w:r>
+      <w:r>
+        <w:rPr>
+          <w:rFonts w:ascii="Consolas" w:hAnsi="Consolas" w:cs="Courier New"/>
+          <w:color w:val="000000"/>
+          <w:sz w:val="17"/>
+          <w:szCs w:val="17"/>
+        </w:rPr>
+        <w:t xml:space="preserve"> </w:t>
+      </w:r>
+      <w:r>
+        <w:rPr>
+          <w:rFonts w:ascii="Consolas" w:hAnsi="Consolas" w:cs="Courier New"/>
+          <w:color w:val="660066"/>
+          <w:sz w:val="17"/>
+          <w:szCs w:val="17"/>
+        </w:rPr>
+        <w:t>Character</w:t>
+      </w:r>
+      <w:r>
+        <w:rPr>
+          <w:rFonts w:ascii="Consolas" w:hAnsi="Consolas" w:cs="Courier New"/>
+          <w:color w:val="666600"/>
+          <w:sz w:val="17"/>
+          <w:szCs w:val="17"/>
+        </w:rPr>
+        <w:t>(</w:t>
+      </w:r>
+      <w:proofErr w:type="gramStart"/>
+      <w:r>
+        <w:rPr>
+          <w:rFonts w:ascii="Consolas" w:hAnsi="Consolas" w:cs="Courier New"/>
+          <w:color w:val="000000"/>
+          <w:sz w:val="17"/>
+          <w:szCs w:val="17"/>
+        </w:rPr>
+        <w:t>props</w:t>
+      </w:r>
+      <w:r>
+        <w:rPr>
+          <w:rFonts w:ascii="Consolas" w:hAnsi="Consolas" w:cs="Courier New"/>
+          <w:color w:val="666600"/>
+          <w:sz w:val="17"/>
+          <w:szCs w:val="17"/>
+        </w:rPr>
+        <w:t>)</w:t>
+      </w:r>
+      <w:r>
+        <w:rPr>
+          <w:rFonts w:ascii="Consolas" w:hAnsi="Consolas" w:cs="Courier New"/>
+          <w:color w:val="666600"/>
+          <w:sz w:val="17"/>
+          <w:szCs w:val="17"/>
+        </w:rPr>
+        <w:t xml:space="preserve"> </w:t>
+      </w:r>
+      <w:r>
+        <w:rPr>
+          <w:rFonts w:ascii="Consolas" w:hAnsi="Consolas" w:cs="Courier New"/>
+          <w:color w:val="666600"/>
+          <w:sz w:val="17"/>
+          <w:szCs w:val="17"/>
+        </w:rPr>
+        <w:t>{</w:t>
+      </w:r>
+      <w:proofErr w:type="gramEnd"/>
+    </w:p>
+    <w:p>
+      <w:pPr>
+        <w:pStyle w:val="NormalWeb"/>
+        <w:pBdr>
+          <w:top w:val="single" w:sz="6" w:space="2" w:color="888888"/>
+          <w:left w:val="single" w:sz="6" w:space="2" w:color="888888"/>
+          <w:bottom w:val="single" w:sz="6" w:space="2" w:color="888888"/>
+          <w:right w:val="single" w:sz="6" w:space="2" w:color="888888"/>
+        </w:pBdr>
+        <w:tabs>
+          <w:tab w:val="left" w:pos="916"/>
+          <w:tab w:val="left" w:pos="1832"/>
+          <w:tab w:val="left" w:pos="2748"/>
+          <w:tab w:val="left" w:pos="3664"/>
+          <w:tab w:val="left" w:pos="4580"/>
+          <w:tab w:val="left" w:pos="5496"/>
+          <w:tab w:val="left" w:pos="6412"/>
+          <w:tab w:val="left" w:pos="7328"/>
+          <w:tab w:val="left" w:pos="8244"/>
+          <w:tab w:val="left" w:pos="9160"/>
+          <w:tab w:val="left" w:pos="10076"/>
+          <w:tab w:val="left" w:pos="10992"/>
+          <w:tab w:val="left" w:pos="11908"/>
+          <w:tab w:val="left" w:pos="12824"/>
+          <w:tab w:val="left" w:pos="13740"/>
+          <w:tab w:val="left" w:pos="14656"/>
+        </w:tabs>
+        <w:spacing w:before="0" w:beforeAutospacing="0" w:after="0" w:afterAutospacing="0"/>
+        <w:divId w:val="2018649341"/>
+        <w:rPr>
+          <w:rFonts w:ascii="Consolas" w:hAnsi="Consolas" w:cs="Courier New"/>
+          <w:sz w:val="17"/>
+          <w:szCs w:val="17"/>
+        </w:rPr>
+      </w:pPr>
+      <w:r>
+        <w:rPr>
+          <w:rFonts w:ascii="Consolas" w:hAnsi="Consolas" w:cs="Courier New"/>
+          <w:sz w:val="17"/>
+          <w:szCs w:val="17"/>
+        </w:rPr>
+        <w:t xml:space="preserve"> 2. </w:t>
+      </w:r>
+    </w:p>
+    <w:p>
+      <w:pPr>
+        <w:pStyle w:val="NormalWeb"/>
+        <w:pBdr>
+          <w:top w:val="single" w:sz="6" w:space="2" w:color="888888"/>
+          <w:left w:val="single" w:sz="6" w:space="2" w:color="888888"/>
+          <w:bottom w:val="single" w:sz="6" w:space="2" w:color="888888"/>
+          <w:right w:val="single" w:sz="6" w:space="2" w:color="888888"/>
+        </w:pBdr>
+        <w:tabs>
+          <w:tab w:val="left" w:pos="916"/>
+          <w:tab w:val="left" w:pos="1832"/>
+          <w:tab w:val="left" w:pos="2748"/>
+          <w:tab w:val="left" w:pos="3664"/>
+          <w:tab w:val="left" w:pos="4580"/>
+          <w:tab w:val="left" w:pos="5496"/>
+          <w:tab w:val="left" w:pos="6412"/>
+          <w:tab w:val="left" w:pos="7328"/>
+          <w:tab w:val="left" w:pos="8244"/>
+          <w:tab w:val="left" w:pos="9160"/>
+          <w:tab w:val="left" w:pos="10076"/>
+          <w:tab w:val="left" w:pos="10992"/>
+          <w:tab w:val="left" w:pos="11908"/>
+          <w:tab w:val="left" w:pos="12824"/>
+          <w:tab w:val="left" w:pos="13740"/>
+          <w:tab w:val="left" w:pos="14656"/>
+        </w:tabs>
+        <w:spacing w:before="0" w:beforeAutospacing="0" w:after="0" w:afterAutospacing="0"/>
+        <w:divId w:val="2018649341"/>
+        <w:rPr>
+          <w:rFonts w:ascii="Consolas" w:hAnsi="Consolas" w:cs="Courier New"/>
+          <w:sz w:val="17"/>
+          <w:szCs w:val="17"/>
+          <w:highlight w:val="yellow"/>
+        </w:rPr>
+      </w:pPr>
+      <w:r>
+        <w:rPr>
+          <w:rFonts w:ascii="Consolas" w:hAnsi="Consolas" w:cs="Courier New"/>
+          <w:sz w:val="17"/>
+          <w:szCs w:val="17"/>
+        </w:rPr>
+        <w:t xml:space="preserve"> </w:t>
+      </w:r>
+      <w:r>
+        <w:rPr>
+          <w:rFonts w:ascii="Consolas" w:hAnsi="Consolas" w:cs="Courier New"/>
+          <w:sz w:val="17"/>
+          <w:szCs w:val="17"/>
+          <w:highlight w:val="yellow"/>
+        </w:rPr>
+        <w:t xml:space="preserve">3. </w:t>
+      </w:r>
+      <w:r>
+        <w:rPr>
+          <w:rFonts w:ascii="Consolas" w:hAnsi="Consolas" w:cs="Courier New"/>
+          <w:color w:val="000000"/>
+          <w:sz w:val="17"/>
+          <w:szCs w:val="17"/>
+          <w:highlight w:val="yellow"/>
+        </w:rPr>
+        <w:t xml:space="preserve">    </w:t>
+      </w:r>
+      <w:proofErr w:type="spellStart"/>
+      <w:r>
+        <w:rPr>
+          <w:rFonts w:ascii="Consolas" w:hAnsi="Consolas" w:cs="Courier New"/>
+          <w:color w:val="000000"/>
+          <w:sz w:val="17"/>
+          <w:szCs w:val="17"/>
+          <w:highlight w:val="yellow"/>
+        </w:rPr>
+        <w:t>m_JumpTime</w:t>
+      </w:r>
+      <w:proofErr w:type="spellEnd"/>
+      <w:r>
+        <w:rPr>
+          <w:rFonts w:ascii="Consolas" w:hAnsi="Consolas" w:cs="Courier New"/>
+          <w:color w:val="000000"/>
+          <w:sz w:val="17"/>
+          <w:szCs w:val="17"/>
+          <w:highlight w:val="yellow"/>
+        </w:rPr>
+        <w:t xml:space="preserve"> </w:t>
+      </w:r>
+      <w:r>
+        <w:rPr>
+          <w:rFonts w:ascii="Consolas" w:hAnsi="Consolas" w:cs="Courier New"/>
+          <w:color w:val="666600"/>
+          <w:sz w:val="17"/>
+          <w:szCs w:val="17"/>
+          <w:highlight w:val="yellow"/>
+        </w:rPr>
+        <w:t>=</w:t>
+      </w:r>
+      <w:r>
+        <w:rPr>
+          <w:rFonts w:ascii="Consolas" w:hAnsi="Consolas" w:cs="Courier New"/>
+          <w:color w:val="000000"/>
+          <w:sz w:val="17"/>
+          <w:szCs w:val="17"/>
+          <w:highlight w:val="yellow"/>
+        </w:rPr>
+        <w:t xml:space="preserve"> JUMP_</w:t>
+      </w:r>
+      <w:proofErr w:type="gramStart"/>
+      <w:r>
+        <w:rPr>
+          <w:rFonts w:ascii="Consolas" w:hAnsi="Consolas" w:cs="Courier New"/>
+          <w:color w:val="000000"/>
+          <w:sz w:val="17"/>
+          <w:szCs w:val="17"/>
+          <w:highlight w:val="yellow"/>
+        </w:rPr>
+        <w:t>TIME</w:t>
+      </w:r>
+      <w:r>
+        <w:rPr>
+          <w:rFonts w:ascii="Consolas" w:hAnsi="Consolas" w:cs="Courier New"/>
+          <w:color w:val="666600"/>
+          <w:sz w:val="17"/>
+          <w:szCs w:val="17"/>
+          <w:highlight w:val="yellow"/>
+        </w:rPr>
+        <w:t>;</w:t>
+      </w:r>
+      <w:proofErr w:type="gramEnd"/>
+    </w:p>
+    <w:p>
+      <w:pPr>
+        <w:pStyle w:val="NormalWeb"/>
+        <w:pBdr>
+          <w:top w:val="single" w:sz="6" w:space="2" w:color="888888"/>
+          <w:left w:val="single" w:sz="6" w:space="2" w:color="888888"/>
+          <w:bottom w:val="single" w:sz="6" w:space="2" w:color="888888"/>
+          <w:right w:val="single" w:sz="6" w:space="2" w:color="888888"/>
+        </w:pBdr>
+        <w:tabs>
+          <w:tab w:val="left" w:pos="916"/>
+          <w:tab w:val="left" w:pos="1832"/>
+          <w:tab w:val="left" w:pos="2748"/>
+          <w:tab w:val="left" w:pos="3664"/>
+          <w:tab w:val="left" w:pos="4580"/>
+          <w:tab w:val="left" w:pos="5496"/>
+          <w:tab w:val="left" w:pos="6412"/>
+          <w:tab w:val="left" w:pos="7328"/>
+          <w:tab w:val="left" w:pos="8244"/>
+          <w:tab w:val="left" w:pos="9160"/>
+          <w:tab w:val="left" w:pos="10076"/>
+          <w:tab w:val="left" w:pos="10992"/>
+          <w:tab w:val="left" w:pos="11908"/>
+          <w:tab w:val="left" w:pos="12824"/>
+          <w:tab w:val="left" w:pos="13740"/>
+          <w:tab w:val="left" w:pos="14656"/>
+        </w:tabs>
+        <w:spacing w:before="0" w:beforeAutospacing="0" w:after="0" w:afterAutospacing="0"/>
+        <w:divId w:val="2018649341"/>
+        <w:rPr>
+          <w:rFonts w:ascii="Consolas" w:hAnsi="Consolas" w:cs="Courier New"/>
+          <w:sz w:val="17"/>
+          <w:szCs w:val="17"/>
+        </w:rPr>
+      </w:pPr>
+      <w:r>
+        <w:rPr>
+          <w:rFonts w:ascii="Consolas" w:hAnsi="Consolas" w:cs="Courier New"/>
+          <w:sz w:val="17"/>
+          <w:szCs w:val="17"/>
+          <w:highlight w:val="yellow"/>
+        </w:rPr>
+        <w:t xml:space="preserve"> 4. </w:t>
+      </w:r>
+      <w:r>
+        <w:rPr>
+          <w:rFonts w:ascii="Consolas" w:hAnsi="Consolas" w:cs="Courier New"/>
+          <w:color w:val="000000"/>
+          <w:sz w:val="17"/>
+          <w:szCs w:val="17"/>
+          <w:highlight w:val="yellow"/>
+        </w:rPr>
+        <w:t xml:space="preserve">    </w:t>
+      </w:r>
+      <w:proofErr w:type="spellStart"/>
+      <w:r>
+        <w:rPr>
+          <w:rFonts w:ascii="Consolas" w:hAnsi="Consolas" w:cs="Courier New"/>
+          <w:color w:val="000000"/>
+          <w:sz w:val="17"/>
+          <w:szCs w:val="17"/>
+          <w:highlight w:val="yellow"/>
+        </w:rPr>
+        <w:t>m_JumpForce</w:t>
+      </w:r>
+      <w:proofErr w:type="spellEnd"/>
+      <w:r>
+        <w:rPr>
+          <w:rFonts w:ascii="Consolas" w:hAnsi="Consolas" w:cs="Courier New"/>
+          <w:color w:val="000000"/>
+          <w:sz w:val="17"/>
+          <w:szCs w:val="17"/>
+          <w:highlight w:val="yellow"/>
+        </w:rPr>
+        <w:t xml:space="preserve"> </w:t>
+      </w:r>
+      <w:r>
+        <w:rPr>
+          <w:rFonts w:ascii="Consolas" w:hAnsi="Consolas" w:cs="Courier New"/>
+          <w:color w:val="666600"/>
+          <w:sz w:val="17"/>
+          <w:szCs w:val="17"/>
+          <w:highlight w:val="yellow"/>
+        </w:rPr>
+        <w:t>=</w:t>
+      </w:r>
+      <w:r>
+        <w:rPr>
+          <w:rFonts w:ascii="Consolas" w:hAnsi="Consolas" w:cs="Courier New"/>
+          <w:color w:val="000000"/>
+          <w:sz w:val="17"/>
+          <w:szCs w:val="17"/>
+          <w:highlight w:val="yellow"/>
+        </w:rPr>
+        <w:t xml:space="preserve"> JUMP_</w:t>
+      </w:r>
+      <w:proofErr w:type="gramStart"/>
+      <w:r>
+        <w:rPr>
+          <w:rFonts w:ascii="Consolas" w:hAnsi="Consolas" w:cs="Courier New"/>
+          <w:color w:val="000000"/>
+          <w:sz w:val="17"/>
+          <w:szCs w:val="17"/>
+          <w:highlight w:val="yellow"/>
+        </w:rPr>
+        <w:t>FORCE</w:t>
+      </w:r>
+      <w:r>
+        <w:rPr>
+          <w:rFonts w:ascii="Consolas" w:hAnsi="Consolas" w:cs="Courier New"/>
+          <w:color w:val="666600"/>
+          <w:sz w:val="17"/>
+          <w:szCs w:val="17"/>
+          <w:highlight w:val="yellow"/>
+        </w:rPr>
+        <w:t>;</w:t>
+      </w:r>
+      <w:proofErr w:type="gramEnd"/>
+    </w:p>
+    <w:p>
+      <w:pPr>
+        <w:pStyle w:val="NormalWeb"/>
+        <w:pBdr>
+          <w:top w:val="single" w:sz="6" w:space="2" w:color="888888"/>
+          <w:left w:val="single" w:sz="6" w:space="2" w:color="888888"/>
+          <w:bottom w:val="single" w:sz="6" w:space="2" w:color="888888"/>
+          <w:right w:val="single" w:sz="6" w:space="2" w:color="888888"/>
+        </w:pBdr>
+        <w:tabs>
+          <w:tab w:val="left" w:pos="916"/>
+          <w:tab w:val="left" w:pos="1832"/>
+          <w:tab w:val="left" w:pos="2748"/>
+          <w:tab w:val="left" w:pos="3664"/>
+          <w:tab w:val="left" w:pos="4580"/>
+          <w:tab w:val="left" w:pos="5496"/>
+          <w:tab w:val="left" w:pos="6412"/>
+          <w:tab w:val="left" w:pos="7328"/>
+          <w:tab w:val="left" w:pos="8244"/>
+          <w:tab w:val="left" w:pos="9160"/>
+          <w:tab w:val="left" w:pos="10076"/>
+          <w:tab w:val="left" w:pos="10992"/>
+          <w:tab w:val="left" w:pos="11908"/>
+          <w:tab w:val="left" w:pos="12824"/>
+          <w:tab w:val="left" w:pos="13740"/>
+          <w:tab w:val="left" w:pos="14656"/>
+        </w:tabs>
+        <w:spacing w:before="0" w:beforeAutospacing="0" w:after="0" w:afterAutospacing="0"/>
+        <w:divId w:val="2018649341"/>
+        <w:rPr>
+          <w:rFonts w:ascii="Consolas" w:hAnsi="Consolas" w:cs="Courier New"/>
+          <w:sz w:val="17"/>
+          <w:szCs w:val="17"/>
+        </w:rPr>
+      </w:pPr>
+      <w:r>
+        <w:rPr>
+          <w:rFonts w:ascii="Consolas" w:hAnsi="Consolas" w:cs="Courier New"/>
+          <w:sz w:val="17"/>
+          <w:szCs w:val="17"/>
+        </w:rPr>
+        <w:t xml:space="preserve"> 5. </w:t>
+      </w:r>
+      <w:r>
+        <w:rPr>
+          <w:rFonts w:ascii="Consolas" w:hAnsi="Consolas" w:cs="Courier New"/>
+          <w:color w:val="000000"/>
+          <w:sz w:val="17"/>
+          <w:szCs w:val="17"/>
+        </w:rPr>
+        <w:t> </w:t>
+      </w:r>
+    </w:p>
+    <w:p>
+      <w:pPr>
+        <w:pStyle w:val="NormalWeb"/>
+        <w:pBdr>
+          <w:top w:val="single" w:sz="6" w:space="2" w:color="888888"/>
+          <w:left w:val="single" w:sz="6" w:space="2" w:color="888888"/>
+          <w:bottom w:val="single" w:sz="6" w:space="2" w:color="888888"/>
+          <w:right w:val="single" w:sz="6" w:space="2" w:color="888888"/>
+        </w:pBdr>
+        <w:tabs>
+          <w:tab w:val="left" w:pos="916"/>
+          <w:tab w:val="left" w:pos="1832"/>
+          <w:tab w:val="left" w:pos="2748"/>
+          <w:tab w:val="left" w:pos="3664"/>
+          <w:tab w:val="left" w:pos="4580"/>
+          <w:tab w:val="left" w:pos="5496"/>
+          <w:tab w:val="left" w:pos="6412"/>
+          <w:tab w:val="left" w:pos="7328"/>
+          <w:tab w:val="left" w:pos="8244"/>
+          <w:tab w:val="left" w:pos="9160"/>
+          <w:tab w:val="left" w:pos="10076"/>
+          <w:tab w:val="left" w:pos="10992"/>
+          <w:tab w:val="left" w:pos="11908"/>
+          <w:tab w:val="left" w:pos="12824"/>
+          <w:tab w:val="left" w:pos="13740"/>
+          <w:tab w:val="left" w:pos="14656"/>
+        </w:tabs>
+        <w:spacing w:before="0" w:beforeAutospacing="0" w:after="0" w:afterAutospacing="0"/>
+        <w:divId w:val="2018649341"/>
+        <w:rPr>
+          <w:rFonts w:ascii="Consolas" w:hAnsi="Consolas" w:cs="Courier New"/>
+          <w:sz w:val="17"/>
+          <w:szCs w:val="17"/>
+          <w:highlight w:val="yellow"/>
+        </w:rPr>
+      </w:pPr>
+      <w:r>
+        <w:rPr>
+          <w:rFonts w:ascii="Consolas" w:hAnsi="Consolas" w:cs="Courier New"/>
+          <w:sz w:val="17"/>
+          <w:szCs w:val="17"/>
+        </w:rPr>
+        <w:t xml:space="preserve"> </w:t>
+      </w:r>
+      <w:r>
+        <w:rPr>
+          <w:rFonts w:ascii="Consolas" w:hAnsi="Consolas" w:cs="Courier New"/>
+          <w:sz w:val="17"/>
+          <w:szCs w:val="17"/>
+          <w:highlight w:val="yellow"/>
+        </w:rPr>
+        <w:t xml:space="preserve">6. </w:t>
+      </w:r>
+      <w:r>
+        <w:rPr>
+          <w:rFonts w:ascii="Consolas" w:hAnsi="Consolas" w:cs="Courier New"/>
+          <w:color w:val="000000"/>
+          <w:sz w:val="17"/>
+          <w:szCs w:val="17"/>
+          <w:highlight w:val="yellow"/>
+        </w:rPr>
+        <w:t xml:space="preserve">    </w:t>
+      </w:r>
+      <w:proofErr w:type="spellStart"/>
+      <w:r>
+        <w:rPr>
+          <w:rFonts w:ascii="Consolas" w:hAnsi="Consolas" w:cs="Courier New"/>
+          <w:color w:val="000000"/>
+          <w:sz w:val="17"/>
+          <w:szCs w:val="17"/>
+          <w:highlight w:val="yellow"/>
+        </w:rPr>
+        <w:t>m_Collider</w:t>
+      </w:r>
+      <w:proofErr w:type="spellEnd"/>
+      <w:r>
+        <w:rPr>
+          <w:rFonts w:ascii="Consolas" w:hAnsi="Consolas" w:cs="Courier New"/>
+          <w:color w:val="000000"/>
+          <w:sz w:val="17"/>
+          <w:szCs w:val="17"/>
+          <w:highlight w:val="yellow"/>
+        </w:rPr>
+        <w:t xml:space="preserve"> </w:t>
+      </w:r>
+      <w:r>
+        <w:rPr>
+          <w:rFonts w:ascii="Consolas" w:hAnsi="Consolas" w:cs="Courier New"/>
+          <w:color w:val="666600"/>
+          <w:sz w:val="17"/>
+          <w:szCs w:val="17"/>
+          <w:highlight w:val="yellow"/>
+        </w:rPr>
+        <w:t>=</w:t>
+      </w:r>
+      <w:r>
+        <w:rPr>
+          <w:rFonts w:ascii="Consolas" w:hAnsi="Consolas" w:cs="Courier New"/>
+          <w:color w:val="000000"/>
+          <w:sz w:val="17"/>
+          <w:szCs w:val="17"/>
+          <w:highlight w:val="yellow"/>
+        </w:rPr>
+        <w:t xml:space="preserve"> </w:t>
+      </w:r>
+      <w:r>
+        <w:rPr>
+          <w:rFonts w:ascii="Consolas" w:hAnsi="Consolas" w:cs="Courier New"/>
+          <w:color w:val="000088"/>
+          <w:sz w:val="17"/>
+          <w:szCs w:val="17"/>
+          <w:highlight w:val="yellow"/>
+        </w:rPr>
+        <w:t>new</w:t>
+      </w:r>
+      <w:r>
+        <w:rPr>
+          <w:rFonts w:ascii="Consolas" w:hAnsi="Consolas" w:cs="Courier New"/>
+          <w:color w:val="000000"/>
+          <w:sz w:val="17"/>
+          <w:szCs w:val="17"/>
+          <w:highlight w:val="yellow"/>
+        </w:rPr>
+        <w:t xml:space="preserve"> </w:t>
+      </w:r>
+      <w:proofErr w:type="gramStart"/>
+      <w:r>
+        <w:rPr>
+          <w:rFonts w:ascii="Consolas" w:hAnsi="Consolas" w:cs="Courier New"/>
+          <w:color w:val="660066"/>
+          <w:sz w:val="17"/>
+          <w:szCs w:val="17"/>
+          <w:highlight w:val="yellow"/>
+        </w:rPr>
+        <w:t>Collider</w:t>
+      </w:r>
+      <w:r>
+        <w:rPr>
+          <w:rFonts w:ascii="Consolas" w:hAnsi="Consolas" w:cs="Courier New"/>
+          <w:color w:val="666600"/>
+          <w:sz w:val="17"/>
+          <w:szCs w:val="17"/>
+          <w:highlight w:val="yellow"/>
+        </w:rPr>
+        <w:t>();</w:t>
+      </w:r>
+      <w:proofErr w:type="gramEnd"/>
+    </w:p>
+    <w:p>
+      <w:pPr>
+        <w:pStyle w:val="NormalWeb"/>
+        <w:pBdr>
+          <w:top w:val="single" w:sz="6" w:space="2" w:color="888888"/>
+          <w:left w:val="single" w:sz="6" w:space="2" w:color="888888"/>
+          <w:bottom w:val="single" w:sz="6" w:space="2" w:color="888888"/>
+          <w:right w:val="single" w:sz="6" w:space="2" w:color="888888"/>
+        </w:pBdr>
+        <w:tabs>
+          <w:tab w:val="left" w:pos="916"/>
+          <w:tab w:val="left" w:pos="1832"/>
+          <w:tab w:val="left" w:pos="2748"/>
+          <w:tab w:val="left" w:pos="3664"/>
+          <w:tab w:val="left" w:pos="4580"/>
+          <w:tab w:val="left" w:pos="5496"/>
+          <w:tab w:val="left" w:pos="6412"/>
+          <w:tab w:val="left" w:pos="7328"/>
+          <w:tab w:val="left" w:pos="8244"/>
+          <w:tab w:val="left" w:pos="9160"/>
+          <w:tab w:val="left" w:pos="10076"/>
+          <w:tab w:val="left" w:pos="10992"/>
+          <w:tab w:val="left" w:pos="11908"/>
+          <w:tab w:val="left" w:pos="12824"/>
+          <w:tab w:val="left" w:pos="13740"/>
+          <w:tab w:val="left" w:pos="14656"/>
+        </w:tabs>
+        <w:spacing w:before="0" w:beforeAutospacing="0" w:after="0" w:afterAutospacing="0"/>
+        <w:divId w:val="2018649341"/>
+        <w:rPr>
+          <w:rFonts w:ascii="Consolas" w:hAnsi="Consolas" w:cs="Courier New"/>
+          <w:sz w:val="17"/>
+          <w:szCs w:val="17"/>
+          <w:highlight w:val="yellow"/>
+        </w:rPr>
+      </w:pPr>
+      <w:r>
+        <w:rPr>
+          <w:rFonts w:ascii="Consolas" w:hAnsi="Consolas" w:cs="Courier New"/>
+          <w:sz w:val="17"/>
+          <w:szCs w:val="17"/>
+          <w:highlight w:val="yellow"/>
+        </w:rPr>
+        <w:t xml:space="preserve"> 7. </w:t>
+      </w:r>
+      <w:r>
+        <w:rPr>
+          <w:rFonts w:ascii="Consolas" w:hAnsi="Consolas" w:cs="Courier New"/>
+          <w:color w:val="000000"/>
+          <w:sz w:val="17"/>
+          <w:szCs w:val="17"/>
+          <w:highlight w:val="yellow"/>
+        </w:rPr>
+        <w:t xml:space="preserve">    </w:t>
+      </w:r>
+      <w:r>
+        <w:rPr>
+          <w:rFonts w:ascii="Consolas" w:hAnsi="Consolas" w:cs="Courier New"/>
+          <w:color w:val="880000"/>
+          <w:sz w:val="17"/>
+          <w:szCs w:val="17"/>
+          <w:highlight w:val="yellow"/>
+        </w:rPr>
+        <w:t xml:space="preserve">// no difference between </w:t>
+      </w:r>
+      <w:proofErr w:type="spellStart"/>
+      <w:r>
+        <w:rPr>
+          <w:rFonts w:ascii="Consolas" w:hAnsi="Consolas" w:cs="Courier New"/>
+          <w:color w:val="880000"/>
+          <w:sz w:val="17"/>
+          <w:szCs w:val="17"/>
+          <w:highlight w:val="yellow"/>
+        </w:rPr>
+        <w:t>SDL_Rect</w:t>
+      </w:r>
+      <w:proofErr w:type="spellEnd"/>
+      <w:r>
+        <w:rPr>
+          <w:rFonts w:ascii="Consolas" w:hAnsi="Consolas" w:cs="Courier New"/>
+          <w:color w:val="880000"/>
+          <w:sz w:val="17"/>
+          <w:szCs w:val="17"/>
+          <w:highlight w:val="yellow"/>
+        </w:rPr>
+        <w:t xml:space="preserve"> defining player and </w:t>
+      </w:r>
+      <w:proofErr w:type="gramStart"/>
+      <w:r>
+        <w:rPr>
+          <w:rFonts w:ascii="Consolas" w:hAnsi="Consolas" w:cs="Courier New"/>
+          <w:color w:val="880000"/>
+          <w:sz w:val="17"/>
+          <w:szCs w:val="17"/>
+          <w:highlight w:val="yellow"/>
+        </w:rPr>
+        <w:t>it's</w:t>
+      </w:r>
+      <w:proofErr w:type="gramEnd"/>
+      <w:r>
+        <w:rPr>
+          <w:rFonts w:ascii="Consolas" w:hAnsi="Consolas" w:cs="Courier New"/>
+          <w:color w:val="880000"/>
+          <w:sz w:val="17"/>
+          <w:szCs w:val="17"/>
+          <w:highlight w:val="yellow"/>
+        </w:rPr>
+        <w:t xml:space="preserve"> collider</w:t>
+      </w:r>
+    </w:p>
+    <w:p>
+      <w:pPr>
+        <w:pStyle w:val="NormalWeb"/>
+        <w:pBdr>
+          <w:top w:val="single" w:sz="6" w:space="2" w:color="888888"/>
+          <w:left w:val="single" w:sz="6" w:space="2" w:color="888888"/>
+          <w:bottom w:val="single" w:sz="6" w:space="2" w:color="888888"/>
+          <w:right w:val="single" w:sz="6" w:space="2" w:color="888888"/>
+        </w:pBdr>
+        <w:tabs>
+          <w:tab w:val="left" w:pos="916"/>
+          <w:tab w:val="left" w:pos="1832"/>
+          <w:tab w:val="left" w:pos="2748"/>
+          <w:tab w:val="left" w:pos="3664"/>
+          <w:tab w:val="left" w:pos="4580"/>
+          <w:tab w:val="left" w:pos="5496"/>
+          <w:tab w:val="left" w:pos="6412"/>
+          <w:tab w:val="left" w:pos="7328"/>
+          <w:tab w:val="left" w:pos="8244"/>
+          <w:tab w:val="left" w:pos="9160"/>
+          <w:tab w:val="left" w:pos="10076"/>
+          <w:tab w:val="left" w:pos="10992"/>
+          <w:tab w:val="left" w:pos="11908"/>
+          <w:tab w:val="left" w:pos="12824"/>
+          <w:tab w:val="left" w:pos="13740"/>
+          <w:tab w:val="left" w:pos="14656"/>
+        </w:tabs>
+        <w:spacing w:before="0" w:beforeAutospacing="0" w:after="0" w:afterAutospacing="0"/>
+        <w:divId w:val="2018649341"/>
+        <w:rPr>
+          <w:rFonts w:ascii="Consolas" w:hAnsi="Consolas" w:cs="Courier New"/>
+          <w:sz w:val="17"/>
+          <w:szCs w:val="17"/>
+        </w:rPr>
+      </w:pPr>
+      <w:r>
+        <w:rPr>
+          <w:rFonts w:ascii="Consolas" w:hAnsi="Consolas" w:cs="Courier New"/>
+          <w:sz w:val="17"/>
+          <w:szCs w:val="17"/>
+          <w:highlight w:val="yellow"/>
+        </w:rPr>
+        <w:t xml:space="preserve"> 8. </w:t>
+      </w:r>
+      <w:r>
+        <w:rPr>
+          <w:rFonts w:ascii="Consolas" w:hAnsi="Consolas" w:cs="Courier New"/>
+          <w:color w:val="000000"/>
+          <w:sz w:val="17"/>
+          <w:szCs w:val="17"/>
+          <w:highlight w:val="yellow"/>
+        </w:rPr>
+        <w:t xml:space="preserve">    </w:t>
+      </w:r>
+      <w:proofErr w:type="spellStart"/>
+      <w:r>
+        <w:rPr>
+          <w:rFonts w:ascii="Consolas" w:hAnsi="Consolas" w:cs="Courier New"/>
+          <w:color w:val="000000"/>
+          <w:sz w:val="17"/>
+          <w:szCs w:val="17"/>
+          <w:highlight w:val="yellow"/>
+        </w:rPr>
+        <w:t>m_Collider</w:t>
+      </w:r>
+      <w:proofErr w:type="spellEnd"/>
+      <w:r>
+        <w:rPr>
+          <w:rFonts w:ascii="Consolas" w:hAnsi="Consolas" w:cs="Courier New"/>
+          <w:color w:val="666600"/>
+          <w:sz w:val="17"/>
+          <w:szCs w:val="17"/>
+          <w:highlight w:val="yellow"/>
+        </w:rPr>
+        <w:t>-&gt;</w:t>
+      </w:r>
+      <w:proofErr w:type="spellStart"/>
+      <w:proofErr w:type="gramStart"/>
+      <w:r>
+        <w:rPr>
+          <w:rFonts w:ascii="Consolas" w:hAnsi="Consolas" w:cs="Courier New"/>
+          <w:color w:val="660066"/>
+          <w:sz w:val="17"/>
+          <w:szCs w:val="17"/>
+          <w:highlight w:val="yellow"/>
+        </w:rPr>
+        <w:t>SetBuffer</w:t>
+      </w:r>
+      <w:proofErr w:type="spellEnd"/>
+      <w:r>
+        <w:rPr>
+          <w:rFonts w:ascii="Consolas" w:hAnsi="Consolas" w:cs="Courier New"/>
+          <w:color w:val="666600"/>
+          <w:sz w:val="17"/>
+          <w:szCs w:val="17"/>
+          <w:highlight w:val="yellow"/>
+        </w:rPr>
+        <w:t>(</w:t>
+      </w:r>
+      <w:proofErr w:type="gramEnd"/>
+      <w:r>
+        <w:rPr>
+          <w:rFonts w:ascii="Consolas" w:hAnsi="Consolas" w:cs="Courier New"/>
+          <w:color w:val="006666"/>
+          <w:sz w:val="17"/>
+          <w:szCs w:val="17"/>
+          <w:highlight w:val="yellow"/>
+        </w:rPr>
+        <w:t>0</w:t>
+      </w:r>
+      <w:r>
+        <w:rPr>
+          <w:rFonts w:ascii="Consolas" w:hAnsi="Consolas" w:cs="Courier New"/>
+          <w:color w:val="666600"/>
+          <w:sz w:val="17"/>
+          <w:szCs w:val="17"/>
+          <w:highlight w:val="yellow"/>
+        </w:rPr>
+        <w:t>,</w:t>
+      </w:r>
+      <w:r>
+        <w:rPr>
+          <w:rFonts w:ascii="Consolas" w:hAnsi="Consolas" w:cs="Courier New"/>
+          <w:color w:val="006666"/>
+          <w:sz w:val="17"/>
+          <w:szCs w:val="17"/>
+          <w:highlight w:val="yellow"/>
+        </w:rPr>
+        <w:t>0</w:t>
+      </w:r>
+      <w:r>
+        <w:rPr>
+          <w:rFonts w:ascii="Consolas" w:hAnsi="Consolas" w:cs="Courier New"/>
+          <w:color w:val="666600"/>
+          <w:sz w:val="17"/>
+          <w:szCs w:val="17"/>
+          <w:highlight w:val="yellow"/>
+        </w:rPr>
+        <w:t>,</w:t>
+      </w:r>
+      <w:r>
+        <w:rPr>
+          <w:rFonts w:ascii="Consolas" w:hAnsi="Consolas" w:cs="Courier New"/>
+          <w:color w:val="006666"/>
+          <w:sz w:val="17"/>
+          <w:szCs w:val="17"/>
+          <w:highlight w:val="yellow"/>
+        </w:rPr>
+        <w:t>0</w:t>
+      </w:r>
+      <w:r>
+        <w:rPr>
+          <w:rFonts w:ascii="Consolas" w:hAnsi="Consolas" w:cs="Courier New"/>
+          <w:color w:val="666600"/>
+          <w:sz w:val="17"/>
+          <w:szCs w:val="17"/>
+          <w:highlight w:val="yellow"/>
+        </w:rPr>
+        <w:t>,</w:t>
+      </w:r>
+      <w:r>
+        <w:rPr>
+          <w:rFonts w:ascii="Consolas" w:hAnsi="Consolas" w:cs="Courier New"/>
+          <w:color w:val="006666"/>
+          <w:sz w:val="17"/>
+          <w:szCs w:val="17"/>
+          <w:highlight w:val="yellow"/>
+        </w:rPr>
+        <w:t>0</w:t>
+      </w:r>
+      <w:proofErr w:type="gramStart"/>
+      <w:r>
+        <w:rPr>
+          <w:rFonts w:ascii="Consolas" w:hAnsi="Consolas" w:cs="Courier New"/>
+          <w:color w:val="666600"/>
+          <w:sz w:val="17"/>
+          <w:szCs w:val="17"/>
+          <w:highlight w:val="yellow"/>
+        </w:rPr>
+        <w:t>);</w:t>
+      </w:r>
+      <w:proofErr w:type="gramEnd"/>
+      <w:r>
+        <w:rPr>
+          <w:rFonts w:ascii="Consolas" w:hAnsi="Consolas" w:cs="Courier New"/>
+          <w:color w:val="000000"/>
+          <w:sz w:val="17"/>
+          <w:szCs w:val="17"/>
+        </w:rPr>
+        <w:t xml:space="preserve"> </w:t>
+      </w:r>
+    </w:p>
+    <w:p>
+      <w:pPr>
+        <w:pStyle w:val="NormalWeb"/>
+        <w:pBdr>
+          <w:top w:val="single" w:sz="6" w:space="2" w:color="888888"/>
+          <w:left w:val="single" w:sz="6" w:space="2" w:color="888888"/>
+          <w:bottom w:val="single" w:sz="6" w:space="2" w:color="888888"/>
+          <w:right w:val="single" w:sz="6" w:space="2" w:color="888888"/>
+        </w:pBdr>
+        <w:tabs>
+          <w:tab w:val="left" w:pos="916"/>
+          <w:tab w:val="left" w:pos="1832"/>
+          <w:tab w:val="left" w:pos="2748"/>
+          <w:tab w:val="left" w:pos="3664"/>
+          <w:tab w:val="left" w:pos="4580"/>
+          <w:tab w:val="left" w:pos="5496"/>
+          <w:tab w:val="left" w:pos="6412"/>
+          <w:tab w:val="left" w:pos="7328"/>
+          <w:tab w:val="left" w:pos="8244"/>
+          <w:tab w:val="left" w:pos="9160"/>
+          <w:tab w:val="left" w:pos="10076"/>
+          <w:tab w:val="left" w:pos="10992"/>
+          <w:tab w:val="left" w:pos="11908"/>
+          <w:tab w:val="left" w:pos="12824"/>
+          <w:tab w:val="left" w:pos="13740"/>
+          <w:tab w:val="left" w:pos="14656"/>
+        </w:tabs>
+        <w:spacing w:before="0" w:beforeAutospacing="0" w:after="0" w:afterAutospacing="0"/>
+        <w:divId w:val="2018649341"/>
+        <w:rPr>
+          <w:rFonts w:ascii="Consolas" w:hAnsi="Consolas" w:cs="Courier New"/>
+          <w:sz w:val="17"/>
+          <w:szCs w:val="17"/>
+        </w:rPr>
+      </w:pPr>
+      <w:r>
+        <w:rPr>
+          <w:rFonts w:ascii="Consolas" w:hAnsi="Consolas" w:cs="Courier New"/>
+          <w:sz w:val="17"/>
+          <w:szCs w:val="17"/>
+        </w:rPr>
+        <w:t xml:space="preserve"> 9. </w:t>
+      </w:r>
+      <w:r>
+        <w:rPr>
+          <w:rFonts w:ascii="Consolas" w:hAnsi="Consolas" w:cs="Courier New"/>
+          <w:color w:val="000000"/>
+          <w:sz w:val="17"/>
+          <w:szCs w:val="17"/>
+        </w:rPr>
+        <w:t xml:space="preserve">    </w:t>
+      </w:r>
+    </w:p>
+    <w:p>
+      <w:pPr>
+        <w:pStyle w:val="NormalWeb"/>
+        <w:pBdr>
+          <w:top w:val="single" w:sz="6" w:space="2" w:color="888888"/>
+          <w:left w:val="single" w:sz="6" w:space="2" w:color="888888"/>
+          <w:bottom w:val="single" w:sz="6" w:space="2" w:color="888888"/>
+          <w:right w:val="single" w:sz="6" w:space="2" w:color="888888"/>
+        </w:pBdr>
+        <w:tabs>
+          <w:tab w:val="left" w:pos="916"/>
+          <w:tab w:val="left" w:pos="1832"/>
+          <w:tab w:val="left" w:pos="2748"/>
+          <w:tab w:val="left" w:pos="3664"/>
+          <w:tab w:val="left" w:pos="4580"/>
+          <w:tab w:val="left" w:pos="5496"/>
+          <w:tab w:val="left" w:pos="6412"/>
+          <w:tab w:val="left" w:pos="7328"/>
+          <w:tab w:val="left" w:pos="8244"/>
+          <w:tab w:val="left" w:pos="9160"/>
+          <w:tab w:val="left" w:pos="10076"/>
+          <w:tab w:val="left" w:pos="10992"/>
+          <w:tab w:val="left" w:pos="11908"/>
+          <w:tab w:val="left" w:pos="12824"/>
+          <w:tab w:val="left" w:pos="13740"/>
+          <w:tab w:val="left" w:pos="14656"/>
+        </w:tabs>
+        <w:spacing w:before="0" w:beforeAutospacing="0" w:after="0" w:afterAutospacing="0"/>
+        <w:divId w:val="2018649341"/>
+        <w:rPr>
+          <w:rFonts w:ascii="Consolas" w:hAnsi="Consolas" w:cs="Courier New"/>
+          <w:sz w:val="17"/>
+          <w:szCs w:val="17"/>
+        </w:rPr>
+      </w:pPr>
+      <w:r>
+        <w:rPr>
+          <w:rFonts w:ascii="Consolas" w:hAnsi="Consolas" w:cs="Courier New"/>
+          <w:sz w:val="17"/>
+          <w:szCs w:val="17"/>
+        </w:rPr>
+        <w:t xml:space="preserve">10. </w:t>
+      </w:r>
+      <w:r>
+        <w:rPr>
+          <w:rFonts w:ascii="Consolas" w:hAnsi="Consolas" w:cs="Courier New"/>
+          <w:color w:val="000000"/>
+          <w:sz w:val="17"/>
+          <w:szCs w:val="17"/>
+        </w:rPr>
+        <w:t xml:space="preserve">    </w:t>
+      </w:r>
+      <w:proofErr w:type="spellStart"/>
+      <w:r>
+        <w:rPr>
+          <w:rFonts w:ascii="Consolas" w:hAnsi="Consolas" w:cs="Courier New"/>
+          <w:color w:val="000000"/>
+          <w:sz w:val="17"/>
+          <w:szCs w:val="17"/>
+        </w:rPr>
+        <w:t>m_RigidBody</w:t>
+      </w:r>
+      <w:proofErr w:type="spellEnd"/>
+      <w:r>
+        <w:rPr>
+          <w:rFonts w:ascii="Consolas" w:hAnsi="Consolas" w:cs="Courier New"/>
+          <w:color w:val="000000"/>
+          <w:sz w:val="17"/>
+          <w:szCs w:val="17"/>
+        </w:rPr>
+        <w:t xml:space="preserve"> </w:t>
+      </w:r>
+      <w:r>
+        <w:rPr>
+          <w:rFonts w:ascii="Consolas" w:hAnsi="Consolas" w:cs="Courier New"/>
+          <w:color w:val="666600"/>
+          <w:sz w:val="17"/>
+          <w:szCs w:val="17"/>
+        </w:rPr>
+        <w:t>=</w:t>
+      </w:r>
+      <w:r>
+        <w:rPr>
+          <w:rFonts w:ascii="Consolas" w:hAnsi="Consolas" w:cs="Courier New"/>
+          <w:color w:val="000000"/>
+          <w:sz w:val="17"/>
+          <w:szCs w:val="17"/>
+        </w:rPr>
+        <w:t xml:space="preserve"> </w:t>
+      </w:r>
+      <w:r>
+        <w:rPr>
+          <w:rFonts w:ascii="Consolas" w:hAnsi="Consolas" w:cs="Courier New"/>
+          <w:color w:val="000088"/>
+          <w:sz w:val="17"/>
+          <w:szCs w:val="17"/>
+        </w:rPr>
+        <w:t>new</w:t>
+      </w:r>
+      <w:r>
+        <w:rPr>
+          <w:rFonts w:ascii="Consolas" w:hAnsi="Consolas" w:cs="Courier New"/>
+          <w:color w:val="000000"/>
+          <w:sz w:val="17"/>
+          <w:szCs w:val="17"/>
+        </w:rPr>
+        <w:t xml:space="preserve"> </w:t>
+      </w:r>
+      <w:proofErr w:type="spellStart"/>
+      <w:proofErr w:type="gramStart"/>
+      <w:r>
+        <w:rPr>
+          <w:rFonts w:ascii="Consolas" w:hAnsi="Consolas" w:cs="Courier New"/>
+          <w:color w:val="660066"/>
+          <w:sz w:val="17"/>
+          <w:szCs w:val="17"/>
+        </w:rPr>
+        <w:t>RigidBody</w:t>
+      </w:r>
+      <w:proofErr w:type="spellEnd"/>
+      <w:r>
+        <w:rPr>
+          <w:rFonts w:ascii="Consolas" w:hAnsi="Consolas" w:cs="Courier New"/>
+          <w:color w:val="666600"/>
+          <w:sz w:val="17"/>
+          <w:szCs w:val="17"/>
+        </w:rPr>
+        <w:t>();</w:t>
+      </w:r>
+      <w:proofErr w:type="gramEnd"/>
+    </w:p>
+    <w:p>
+      <w:pPr>
+        <w:pStyle w:val="NormalWeb"/>
+        <w:pBdr>
+          <w:top w:val="single" w:sz="6" w:space="2" w:color="888888"/>
+          <w:left w:val="single" w:sz="6" w:space="2" w:color="888888"/>
+          <w:bottom w:val="single" w:sz="6" w:space="2" w:color="888888"/>
+          <w:right w:val="single" w:sz="6" w:space="2" w:color="888888"/>
+        </w:pBdr>
+        <w:tabs>
+          <w:tab w:val="left" w:pos="916"/>
+          <w:tab w:val="left" w:pos="1832"/>
+          <w:tab w:val="left" w:pos="2748"/>
+          <w:tab w:val="left" w:pos="3664"/>
+          <w:tab w:val="left" w:pos="4580"/>
+          <w:tab w:val="left" w:pos="5496"/>
+          <w:tab w:val="left" w:pos="6412"/>
+          <w:tab w:val="left" w:pos="7328"/>
+          <w:tab w:val="left" w:pos="8244"/>
+          <w:tab w:val="left" w:pos="9160"/>
+          <w:tab w:val="left" w:pos="10076"/>
+          <w:tab w:val="left" w:pos="10992"/>
+          <w:tab w:val="left" w:pos="11908"/>
+          <w:tab w:val="left" w:pos="12824"/>
+          <w:tab w:val="left" w:pos="13740"/>
+          <w:tab w:val="left" w:pos="14656"/>
+        </w:tabs>
+        <w:spacing w:before="0" w:beforeAutospacing="0" w:after="0" w:afterAutospacing="0"/>
+        <w:divId w:val="2018649341"/>
+        <w:rPr>
+          <w:rFonts w:ascii="Consolas" w:hAnsi="Consolas" w:cs="Courier New"/>
+          <w:sz w:val="17"/>
+          <w:szCs w:val="17"/>
+        </w:rPr>
+      </w:pPr>
+      <w:r>
+        <w:rPr>
+          <w:rFonts w:ascii="Consolas" w:hAnsi="Consolas" w:cs="Courier New"/>
+          <w:sz w:val="17"/>
+          <w:szCs w:val="17"/>
+          <w:highlight w:val="yellow"/>
+        </w:rPr>
+        <w:t xml:space="preserve">11. </w:t>
+      </w:r>
+      <w:r>
+        <w:rPr>
+          <w:rFonts w:ascii="Consolas" w:hAnsi="Consolas" w:cs="Courier New"/>
+          <w:color w:val="000000"/>
+          <w:sz w:val="17"/>
+          <w:szCs w:val="17"/>
+          <w:highlight w:val="yellow"/>
+        </w:rPr>
+        <w:t xml:space="preserve">    </w:t>
+      </w:r>
+      <w:proofErr w:type="spellStart"/>
+      <w:r>
+        <w:rPr>
+          <w:rFonts w:ascii="Consolas" w:hAnsi="Consolas" w:cs="Courier New"/>
+          <w:color w:val="000000"/>
+          <w:sz w:val="17"/>
+          <w:szCs w:val="17"/>
+          <w:highlight w:val="yellow"/>
+        </w:rPr>
+        <w:t>m_RigidBody</w:t>
+      </w:r>
+      <w:proofErr w:type="spellEnd"/>
+      <w:r>
+        <w:rPr>
+          <w:rFonts w:ascii="Consolas" w:hAnsi="Consolas" w:cs="Courier New"/>
+          <w:color w:val="666600"/>
+          <w:sz w:val="17"/>
+          <w:szCs w:val="17"/>
+          <w:highlight w:val="yellow"/>
+        </w:rPr>
+        <w:t>-&gt;</w:t>
+      </w:r>
+      <w:proofErr w:type="spellStart"/>
+      <w:proofErr w:type="gramStart"/>
+      <w:r>
+        <w:rPr>
+          <w:rFonts w:ascii="Consolas" w:hAnsi="Consolas" w:cs="Courier New"/>
+          <w:color w:val="660066"/>
+          <w:sz w:val="17"/>
+          <w:szCs w:val="17"/>
+          <w:highlight w:val="yellow"/>
+        </w:rPr>
+        <w:t>SetGravity</w:t>
+      </w:r>
+      <w:proofErr w:type="spellEnd"/>
+      <w:r>
+        <w:rPr>
+          <w:rFonts w:ascii="Consolas" w:hAnsi="Consolas" w:cs="Courier New"/>
+          <w:color w:val="666600"/>
+          <w:sz w:val="17"/>
+          <w:szCs w:val="17"/>
+          <w:highlight w:val="yellow"/>
+        </w:rPr>
+        <w:t>(</w:t>
+      </w:r>
+      <w:proofErr w:type="gramEnd"/>
+      <w:r>
+        <w:rPr>
+          <w:rFonts w:ascii="Consolas" w:hAnsi="Consolas" w:cs="Courier New"/>
+          <w:color w:val="006666"/>
+          <w:sz w:val="17"/>
+          <w:szCs w:val="17"/>
+          <w:highlight w:val="yellow"/>
+        </w:rPr>
+        <w:t>3.0f</w:t>
+      </w:r>
+      <w:proofErr w:type="gramStart"/>
+      <w:r>
+        <w:rPr>
+          <w:rFonts w:ascii="Consolas" w:hAnsi="Consolas" w:cs="Courier New"/>
+          <w:color w:val="666600"/>
+          <w:sz w:val="17"/>
+          <w:szCs w:val="17"/>
+          <w:highlight w:val="yellow"/>
+        </w:rPr>
+        <w:t>);</w:t>
+      </w:r>
+      <w:r>
+        <w:rPr>
+          <w:rFonts w:ascii="Consolas" w:hAnsi="Consolas" w:cs="Courier New"/>
+          <w:color w:val="000000"/>
+          <w:sz w:val="17"/>
+          <w:szCs w:val="17"/>
+          <w:highlight w:val="yellow"/>
+        </w:rPr>
+        <w:t xml:space="preserve">  </w:t>
+      </w:r>
+      <w:r>
+        <w:rPr>
+          <w:rFonts w:ascii="Consolas" w:hAnsi="Consolas" w:cs="Courier New"/>
+          <w:color w:val="880000"/>
+          <w:sz w:val="17"/>
+          <w:szCs w:val="17"/>
+          <w:highlight w:val="yellow"/>
+        </w:rPr>
+        <w:t>/</w:t>
+      </w:r>
+      <w:proofErr w:type="gramEnd"/>
+      <w:r>
+        <w:rPr>
+          <w:rFonts w:ascii="Consolas" w:hAnsi="Consolas" w:cs="Courier New"/>
+          <w:color w:val="880000"/>
+          <w:sz w:val="17"/>
+          <w:szCs w:val="17"/>
+          <w:highlight w:val="yellow"/>
+        </w:rPr>
+        <w:t>/ Set the natural pull of gravity</w:t>
+      </w:r>
+    </w:p>
+    <w:p>
+      <w:pPr>
+        <w:pStyle w:val="NormalWeb"/>
+        <w:pBdr>
+          <w:top w:val="single" w:sz="6" w:space="2" w:color="888888"/>
+          <w:left w:val="single" w:sz="6" w:space="2" w:color="888888"/>
+          <w:bottom w:val="single" w:sz="6" w:space="2" w:color="888888"/>
+          <w:right w:val="single" w:sz="6" w:space="2" w:color="888888"/>
+        </w:pBdr>
+        <w:tabs>
+          <w:tab w:val="left" w:pos="916"/>
+          <w:tab w:val="left" w:pos="1832"/>
+          <w:tab w:val="left" w:pos="2748"/>
+          <w:tab w:val="left" w:pos="3664"/>
+          <w:tab w:val="left" w:pos="4580"/>
+          <w:tab w:val="left" w:pos="5496"/>
+          <w:tab w:val="left" w:pos="6412"/>
+          <w:tab w:val="left" w:pos="7328"/>
+          <w:tab w:val="left" w:pos="8244"/>
+          <w:tab w:val="left" w:pos="9160"/>
+          <w:tab w:val="left" w:pos="10076"/>
+          <w:tab w:val="left" w:pos="10992"/>
+          <w:tab w:val="left" w:pos="11908"/>
+          <w:tab w:val="left" w:pos="12824"/>
+          <w:tab w:val="left" w:pos="13740"/>
+          <w:tab w:val="left" w:pos="14656"/>
+        </w:tabs>
+        <w:spacing w:before="0" w:beforeAutospacing="0" w:after="0" w:afterAutospacing="0"/>
+        <w:divId w:val="2018649341"/>
+        <w:rPr>
+          <w:rFonts w:ascii="Consolas" w:hAnsi="Consolas" w:cs="Courier New"/>
+          <w:sz w:val="17"/>
+          <w:szCs w:val="17"/>
+        </w:rPr>
+      </w:pPr>
+      <w:r>
+        <w:rPr>
+          <w:rFonts w:ascii="Consolas" w:hAnsi="Consolas" w:cs="Courier New"/>
+          <w:sz w:val="17"/>
+          <w:szCs w:val="17"/>
+        </w:rPr>
+        <w:t xml:space="preserve">12. </w:t>
+      </w:r>
+      <w:r>
+        <w:rPr>
+          <w:rFonts w:ascii="Consolas" w:hAnsi="Consolas" w:cs="Courier New"/>
+          <w:color w:val="000000"/>
+          <w:sz w:val="17"/>
+          <w:szCs w:val="17"/>
+        </w:rPr>
+        <w:t xml:space="preserve">    </w:t>
+      </w:r>
+    </w:p>
+    <w:p>
+      <w:pPr>
+        <w:pStyle w:val="NormalWeb"/>
+        <w:pBdr>
+          <w:top w:val="single" w:sz="6" w:space="2" w:color="888888"/>
+          <w:left w:val="single" w:sz="6" w:space="2" w:color="888888"/>
+          <w:bottom w:val="single" w:sz="6" w:space="2" w:color="888888"/>
+          <w:right w:val="single" w:sz="6" w:space="2" w:color="888888"/>
+        </w:pBdr>
+        <w:tabs>
+          <w:tab w:val="left" w:pos="916"/>
+          <w:tab w:val="left" w:pos="1832"/>
+          <w:tab w:val="left" w:pos="2748"/>
+          <w:tab w:val="left" w:pos="3664"/>
+          <w:tab w:val="left" w:pos="4580"/>
+          <w:tab w:val="left" w:pos="5496"/>
+          <w:tab w:val="left" w:pos="6412"/>
+          <w:tab w:val="left" w:pos="7328"/>
+          <w:tab w:val="left" w:pos="8244"/>
+          <w:tab w:val="left" w:pos="9160"/>
+          <w:tab w:val="left" w:pos="10076"/>
+          <w:tab w:val="left" w:pos="10992"/>
+          <w:tab w:val="left" w:pos="11908"/>
+          <w:tab w:val="left" w:pos="12824"/>
+          <w:tab w:val="left" w:pos="13740"/>
+          <w:tab w:val="left" w:pos="14656"/>
+        </w:tabs>
+        <w:spacing w:before="0" w:beforeAutospacing="0" w:after="0" w:afterAutospacing="0"/>
+        <w:divId w:val="2018649341"/>
+        <w:rPr>
+          <w:rFonts w:ascii="Consolas" w:hAnsi="Consolas" w:cs="Courier New"/>
+          <w:sz w:val="17"/>
+          <w:szCs w:val="17"/>
+        </w:rPr>
+      </w:pPr>
+      <w:r>
+        <w:rPr>
+          <w:rFonts w:ascii="Consolas" w:hAnsi="Consolas" w:cs="Courier New"/>
+          <w:sz w:val="17"/>
+          <w:szCs w:val="17"/>
+        </w:rPr>
+        <w:t xml:space="preserve">13. </w:t>
+      </w:r>
+      <w:r>
+        <w:rPr>
+          <w:rFonts w:ascii="Consolas" w:hAnsi="Consolas" w:cs="Courier New"/>
+          <w:color w:val="000000"/>
+          <w:sz w:val="17"/>
+          <w:szCs w:val="17"/>
+        </w:rPr>
+        <w:t xml:space="preserve">    </w:t>
+      </w:r>
+      <w:proofErr w:type="spellStart"/>
+      <w:r>
+        <w:rPr>
+          <w:rFonts w:ascii="Consolas" w:hAnsi="Consolas" w:cs="Courier New"/>
+          <w:color w:val="000000"/>
+          <w:sz w:val="17"/>
+          <w:szCs w:val="17"/>
+        </w:rPr>
+        <w:t>m_Animation</w:t>
+      </w:r>
+      <w:proofErr w:type="spellEnd"/>
+      <w:r>
+        <w:rPr>
+          <w:rFonts w:ascii="Consolas" w:hAnsi="Consolas" w:cs="Courier New"/>
+          <w:color w:val="000000"/>
+          <w:sz w:val="17"/>
+          <w:szCs w:val="17"/>
+        </w:rPr>
+        <w:t xml:space="preserve"> </w:t>
+      </w:r>
+      <w:r>
+        <w:rPr>
+          <w:rFonts w:ascii="Consolas" w:hAnsi="Consolas" w:cs="Courier New"/>
+          <w:color w:val="666600"/>
+          <w:sz w:val="17"/>
+          <w:szCs w:val="17"/>
+        </w:rPr>
+        <w:t>=</w:t>
+      </w:r>
+      <w:r>
+        <w:rPr>
+          <w:rFonts w:ascii="Consolas" w:hAnsi="Consolas" w:cs="Courier New"/>
+          <w:color w:val="000000"/>
+          <w:sz w:val="17"/>
+          <w:szCs w:val="17"/>
+        </w:rPr>
+        <w:t xml:space="preserve"> </w:t>
+      </w:r>
+      <w:r>
+        <w:rPr>
+          <w:rFonts w:ascii="Consolas" w:hAnsi="Consolas" w:cs="Courier New"/>
+          <w:color w:val="000088"/>
+          <w:sz w:val="17"/>
+          <w:szCs w:val="17"/>
+        </w:rPr>
+        <w:t>new</w:t>
+      </w:r>
+      <w:r>
+        <w:rPr>
+          <w:rFonts w:ascii="Consolas" w:hAnsi="Consolas" w:cs="Courier New"/>
+          <w:color w:val="000000"/>
+          <w:sz w:val="17"/>
+          <w:szCs w:val="17"/>
+        </w:rPr>
+        <w:t xml:space="preserve"> </w:t>
+      </w:r>
+      <w:proofErr w:type="gramStart"/>
+      <w:r>
+        <w:rPr>
+          <w:rFonts w:ascii="Consolas" w:hAnsi="Consolas" w:cs="Courier New"/>
+          <w:color w:val="660066"/>
+          <w:sz w:val="17"/>
+          <w:szCs w:val="17"/>
+        </w:rPr>
+        <w:t>Animation</w:t>
+      </w:r>
+      <w:r>
+        <w:rPr>
+          <w:rFonts w:ascii="Consolas" w:hAnsi="Consolas" w:cs="Courier New"/>
+          <w:color w:val="666600"/>
+          <w:sz w:val="17"/>
+          <w:szCs w:val="17"/>
+        </w:rPr>
+        <w:t>();</w:t>
+      </w:r>
+      <w:proofErr w:type="gramEnd"/>
+    </w:p>
+    <w:p>
+      <w:pPr>
+        <w:pStyle w:val="NormalWeb"/>
+        <w:pBdr>
+          <w:top w:val="single" w:sz="6" w:space="2" w:color="888888"/>
+          <w:left w:val="single" w:sz="6" w:space="2" w:color="888888"/>
+          <w:bottom w:val="single" w:sz="6" w:space="2" w:color="888888"/>
+          <w:right w:val="single" w:sz="6" w:space="2" w:color="888888"/>
+        </w:pBdr>
+        <w:tabs>
+          <w:tab w:val="left" w:pos="916"/>
+          <w:tab w:val="left" w:pos="1832"/>
+          <w:tab w:val="left" w:pos="2748"/>
+          <w:tab w:val="left" w:pos="3664"/>
+          <w:tab w:val="left" w:pos="4580"/>
+          <w:tab w:val="left" w:pos="5496"/>
+          <w:tab w:val="left" w:pos="6412"/>
+          <w:tab w:val="left" w:pos="7328"/>
+          <w:tab w:val="left" w:pos="8244"/>
+          <w:tab w:val="left" w:pos="9160"/>
+          <w:tab w:val="left" w:pos="10076"/>
+          <w:tab w:val="left" w:pos="10992"/>
+          <w:tab w:val="left" w:pos="11908"/>
+          <w:tab w:val="left" w:pos="12824"/>
+          <w:tab w:val="left" w:pos="13740"/>
+          <w:tab w:val="left" w:pos="14656"/>
+        </w:tabs>
+        <w:spacing w:before="0" w:beforeAutospacing="0" w:after="0" w:afterAutospacing="0"/>
+        <w:divId w:val="2018649341"/>
+        <w:rPr>
+          <w:rFonts w:ascii="Consolas" w:hAnsi="Consolas" w:cs="Courier New"/>
+          <w:sz w:val="17"/>
+          <w:szCs w:val="17"/>
+        </w:rPr>
+      </w:pPr>
+      <w:r>
+        <w:rPr>
+          <w:rFonts w:ascii="Consolas" w:hAnsi="Consolas" w:cs="Courier New"/>
+          <w:sz w:val="17"/>
+          <w:szCs w:val="17"/>
+        </w:rPr>
+        <w:t xml:space="preserve">14. </w:t>
+      </w:r>
+      <w:r>
+        <w:rPr>
+          <w:rFonts w:ascii="Consolas" w:hAnsi="Consolas" w:cs="Courier New"/>
+          <w:color w:val="000000"/>
+          <w:sz w:val="17"/>
+          <w:szCs w:val="17"/>
+        </w:rPr>
+        <w:t xml:space="preserve">    </w:t>
+      </w:r>
+      <w:proofErr w:type="spellStart"/>
+      <w:r>
+        <w:rPr>
+          <w:rFonts w:ascii="Consolas" w:hAnsi="Consolas" w:cs="Courier New"/>
+          <w:color w:val="000000"/>
+          <w:sz w:val="17"/>
+          <w:szCs w:val="17"/>
+        </w:rPr>
+        <w:t>m_Animation</w:t>
+      </w:r>
+      <w:proofErr w:type="spellEnd"/>
+      <w:r>
+        <w:rPr>
+          <w:rFonts w:ascii="Consolas" w:hAnsi="Consolas" w:cs="Courier New"/>
+          <w:color w:val="666600"/>
+          <w:sz w:val="17"/>
+          <w:szCs w:val="17"/>
+        </w:rPr>
+        <w:t>-&gt;</w:t>
+      </w:r>
+      <w:proofErr w:type="spellStart"/>
+      <w:proofErr w:type="gramStart"/>
+      <w:r>
+        <w:rPr>
+          <w:rFonts w:ascii="Consolas" w:hAnsi="Consolas" w:cs="Courier New"/>
+          <w:color w:val="660066"/>
+          <w:sz w:val="17"/>
+          <w:szCs w:val="17"/>
+        </w:rPr>
+        <w:t>SetProps</w:t>
+      </w:r>
+      <w:proofErr w:type="spellEnd"/>
+      <w:r>
+        <w:rPr>
+          <w:rFonts w:ascii="Consolas" w:hAnsi="Consolas" w:cs="Courier New"/>
+          <w:color w:val="666600"/>
+          <w:sz w:val="17"/>
+          <w:szCs w:val="17"/>
+        </w:rPr>
+        <w:t>(</w:t>
+      </w:r>
+      <w:proofErr w:type="spellStart"/>
+      <w:proofErr w:type="gramEnd"/>
+      <w:r>
+        <w:rPr>
+          <w:rFonts w:ascii="Consolas" w:hAnsi="Consolas" w:cs="Courier New"/>
+          <w:color w:val="000000"/>
+          <w:sz w:val="17"/>
+          <w:szCs w:val="17"/>
+        </w:rPr>
+        <w:t>m_TextureID</w:t>
+      </w:r>
+      <w:proofErr w:type="spellEnd"/>
+      <w:r>
+        <w:rPr>
+          <w:rFonts w:ascii="Consolas" w:hAnsi="Consolas" w:cs="Courier New"/>
+          <w:color w:val="666600"/>
+          <w:sz w:val="17"/>
+          <w:szCs w:val="17"/>
+        </w:rPr>
+        <w:t>,</w:t>
+      </w:r>
+      <w:r>
+        <w:rPr>
+          <w:rFonts w:ascii="Consolas" w:hAnsi="Consolas" w:cs="Courier New"/>
+          <w:color w:val="000000"/>
+          <w:sz w:val="17"/>
+          <w:szCs w:val="17"/>
+        </w:rPr>
+        <w:t xml:space="preserve"> </w:t>
+      </w:r>
+      <w:r>
+        <w:rPr>
+          <w:rFonts w:ascii="Consolas" w:hAnsi="Consolas" w:cs="Courier New"/>
+          <w:color w:val="006666"/>
+          <w:sz w:val="17"/>
+          <w:szCs w:val="17"/>
+        </w:rPr>
+        <w:t>0</w:t>
+      </w:r>
+      <w:r>
+        <w:rPr>
+          <w:rFonts w:ascii="Consolas" w:hAnsi="Consolas" w:cs="Courier New"/>
+          <w:color w:val="666600"/>
+          <w:sz w:val="17"/>
+          <w:szCs w:val="17"/>
+        </w:rPr>
+        <w:t>,</w:t>
+      </w:r>
+      <w:r>
+        <w:rPr>
+          <w:rFonts w:ascii="Consolas" w:hAnsi="Consolas" w:cs="Courier New"/>
+          <w:color w:val="000000"/>
+          <w:sz w:val="17"/>
+          <w:szCs w:val="17"/>
+        </w:rPr>
+        <w:t xml:space="preserve"> </w:t>
+      </w:r>
+      <w:r>
+        <w:rPr>
+          <w:rFonts w:ascii="Consolas" w:hAnsi="Consolas" w:cs="Courier New"/>
+          <w:color w:val="006666"/>
+          <w:sz w:val="17"/>
+          <w:szCs w:val="17"/>
+        </w:rPr>
+        <w:t>8</w:t>
+      </w:r>
+      <w:r>
+        <w:rPr>
+          <w:rFonts w:ascii="Consolas" w:hAnsi="Consolas" w:cs="Courier New"/>
+          <w:color w:val="666600"/>
+          <w:sz w:val="17"/>
+          <w:szCs w:val="17"/>
+        </w:rPr>
+        <w:t>,</w:t>
+      </w:r>
+      <w:r>
+        <w:rPr>
+          <w:rFonts w:ascii="Consolas" w:hAnsi="Consolas" w:cs="Courier New"/>
+          <w:color w:val="000000"/>
+          <w:sz w:val="17"/>
+          <w:szCs w:val="17"/>
+        </w:rPr>
+        <w:t xml:space="preserve"> </w:t>
+      </w:r>
+      <w:r>
+        <w:rPr>
+          <w:rFonts w:ascii="Consolas" w:hAnsi="Consolas" w:cs="Courier New"/>
+          <w:color w:val="006666"/>
+          <w:sz w:val="17"/>
+          <w:szCs w:val="17"/>
+        </w:rPr>
+        <w:t>100</w:t>
+      </w:r>
+      <w:proofErr w:type="gramStart"/>
+      <w:r>
+        <w:rPr>
+          <w:rFonts w:ascii="Consolas" w:hAnsi="Consolas" w:cs="Courier New"/>
+          <w:color w:val="666600"/>
+          <w:sz w:val="17"/>
+          <w:szCs w:val="17"/>
+        </w:rPr>
+        <w:t>);</w:t>
+      </w:r>
+      <w:proofErr w:type="gramEnd"/>
+    </w:p>
+    <w:p>
+      <w:pPr>
+        <w:pStyle w:val="NormalWeb"/>
+        <w:pBdr>
+          <w:top w:val="single" w:sz="6" w:space="2" w:color="888888"/>
+          <w:left w:val="single" w:sz="6" w:space="2" w:color="888888"/>
+          <w:bottom w:val="single" w:sz="6" w:space="2" w:color="888888"/>
+          <w:right w:val="single" w:sz="6" w:space="2" w:color="888888"/>
+        </w:pBdr>
+        <w:tabs>
+          <w:tab w:val="left" w:pos="916"/>
+          <w:tab w:val="left" w:pos="1832"/>
+          <w:tab w:val="left" w:pos="2748"/>
+          <w:tab w:val="left" w:pos="3664"/>
+          <w:tab w:val="left" w:pos="4580"/>
+          <w:tab w:val="left" w:pos="5496"/>
+          <w:tab w:val="left" w:pos="6412"/>
+          <w:tab w:val="left" w:pos="7328"/>
+          <w:tab w:val="left" w:pos="8244"/>
+          <w:tab w:val="left" w:pos="9160"/>
+          <w:tab w:val="left" w:pos="10076"/>
+          <w:tab w:val="left" w:pos="10992"/>
+          <w:tab w:val="left" w:pos="11908"/>
+          <w:tab w:val="left" w:pos="12824"/>
+          <w:tab w:val="left" w:pos="13740"/>
+          <w:tab w:val="left" w:pos="14656"/>
+        </w:tabs>
+        <w:spacing w:before="0" w:beforeAutospacing="0" w:after="0" w:afterAutospacing="0"/>
+        <w:divId w:val="2018649341"/>
+        <w:rPr>
+          <w:rFonts w:ascii="Consolas" w:hAnsi="Consolas" w:cs="Courier New"/>
+          <w:sz w:val="17"/>
+          <w:szCs w:val="17"/>
+        </w:rPr>
+      </w:pPr>
+      <w:proofErr w:type="gramStart"/>
+      <w:r>
+        <w:rPr>
+          <w:rFonts w:ascii="Consolas" w:hAnsi="Consolas" w:cs="Courier New"/>
+          <w:sz w:val="17"/>
+          <w:szCs w:val="17"/>
+        </w:rPr>
+        <w:t xml:space="preserve">15. </w:t>
+      </w:r>
+      <w:r>
+        <w:rPr>
+          <w:rFonts w:ascii="Consolas" w:hAnsi="Consolas" w:cs="Courier New"/>
+          <w:color w:val="666600"/>
+          <w:sz w:val="17"/>
+          <w:szCs w:val="17"/>
+        </w:rPr>
+        <w:t>}</w:t>
+      </w:r>
+      <w:proofErr w:type="gramEnd"/>
+    </w:p>
+    <w:p/>
+    <w:p>
+      <w:r>
+        <w:t>On lines 3 and 4, we initialize the jump time member variables.</w:t>
+      </w:r>
+    </w:p>
+    <w:p>
+      <w:r>
+        <w:t xml:space="preserve">On lines 6-8, we create and initialize the collider box. At this time being set to (0,0,0,0) means we will have no changes from the </w:t>
+      </w:r>
+      <w:proofErr w:type="spellStart"/>
+      <w:r>
+        <w:t>SDL_Rect</w:t>
+      </w:r>
+      <w:proofErr w:type="spellEnd"/>
+      <w:r>
+        <w:t xml:space="preserve"> definition the Warrior sprite frame takes up. We are doing this </w:t>
+      </w:r>
+      <w:proofErr w:type="gramStart"/>
+      <w:r>
+        <w:t>in order to</w:t>
+      </w:r>
+      <w:proofErr w:type="gramEnd"/>
+      <w:r>
+        <w:t xml:space="preserve"> see an artificial box we will create before adjusting the collider.</w:t>
+      </w:r>
+    </w:p>
+    <w:p>
+      <w:r>
+        <w:t xml:space="preserve">On line 11, we set the force of gravity to something less than the default of 9.8f defined in the </w:t>
+      </w:r>
+      <w:proofErr w:type="spellStart"/>
+      <w:r>
+        <w:t>RigidBody</w:t>
+      </w:r>
+      <w:proofErr w:type="spellEnd"/>
+      <w:r>
+        <w:t>.</w:t>
+      </w:r>
+    </w:p>
+    <w:p/>
+    <w:p>
+      <w:pPr>
+        <w:pStyle w:val="ListParagraph"/>
+        <w:numPr>
+          <w:ilvl w:val="0"/>
+          <w:numId w:val="127"/>
+        </w:numPr>
+      </w:pPr>
+      <w:r>
+        <w:t xml:space="preserve">Update the </w:t>
+      </w:r>
+      <w:proofErr w:type="gramStart"/>
+      <w:r>
+        <w:t>Warrior::Draw(</w:t>
+      </w:r>
+      <w:proofErr w:type="gramEnd"/>
+      <w:r>
+        <w:t>) to draw our collider box:</w:t>
+      </w:r>
+    </w:p>
+    <w:p/>
+    <w:p>
+      <w:pPr>
+        <w:pStyle w:val="NormalWeb"/>
+        <w:pBdr>
+          <w:top w:val="single" w:sz="6" w:space="2" w:color="888888"/>
+          <w:left w:val="single" w:sz="6" w:space="2" w:color="888888"/>
+          <w:bottom w:val="single" w:sz="6" w:space="2" w:color="888888"/>
+          <w:right w:val="single" w:sz="6" w:space="2" w:color="888888"/>
+        </w:pBdr>
+        <w:tabs>
+          <w:tab w:val="left" w:pos="916"/>
+          <w:tab w:val="left" w:pos="1832"/>
+          <w:tab w:val="left" w:pos="2748"/>
+          <w:tab w:val="left" w:pos="3664"/>
+          <w:tab w:val="left" w:pos="4580"/>
+          <w:tab w:val="left" w:pos="5496"/>
+          <w:tab w:val="left" w:pos="6412"/>
+          <w:tab w:val="left" w:pos="7328"/>
+          <w:tab w:val="left" w:pos="8244"/>
+          <w:tab w:val="left" w:pos="9160"/>
+          <w:tab w:val="left" w:pos="10076"/>
+          <w:tab w:val="left" w:pos="10992"/>
+          <w:tab w:val="left" w:pos="11908"/>
+          <w:tab w:val="left" w:pos="12824"/>
+          <w:tab w:val="left" w:pos="13740"/>
+          <w:tab w:val="left" w:pos="14656"/>
+        </w:tabs>
+        <w:spacing w:before="0" w:beforeAutospacing="0" w:after="0" w:afterAutospacing="0"/>
+        <w:divId w:val="1461419437"/>
+        <w:rPr>
+          <w:rFonts w:ascii="Consolas" w:hAnsi="Consolas" w:cs="Courier New"/>
+          <w:sz w:val="17"/>
+          <w:szCs w:val="17"/>
+        </w:rPr>
+      </w:pPr>
+      <w:r>
+        <w:rPr>
+          <w:rFonts w:ascii="Consolas" w:hAnsi="Consolas" w:cs="Courier New"/>
+          <w:sz w:val="17"/>
+          <w:szCs w:val="17"/>
+        </w:rPr>
+        <w:t xml:space="preserve"> 1. </w:t>
+      </w:r>
+      <w:r>
+        <w:rPr>
+          <w:rFonts w:ascii="Consolas" w:hAnsi="Consolas" w:cs="Courier New"/>
+          <w:color w:val="000088"/>
+          <w:sz w:val="17"/>
+          <w:szCs w:val="17"/>
+        </w:rPr>
+        <w:t>void</w:t>
+      </w:r>
+      <w:r>
+        <w:rPr>
+          <w:rFonts w:ascii="Consolas" w:hAnsi="Consolas" w:cs="Courier New"/>
+          <w:color w:val="000000"/>
+          <w:sz w:val="17"/>
+          <w:szCs w:val="17"/>
+        </w:rPr>
+        <w:t xml:space="preserve"> </w:t>
+      </w:r>
+      <w:proofErr w:type="gramStart"/>
+      <w:r>
+        <w:rPr>
+          <w:rFonts w:ascii="Consolas" w:hAnsi="Consolas" w:cs="Courier New"/>
+          <w:color w:val="660066"/>
+          <w:sz w:val="17"/>
+          <w:szCs w:val="17"/>
+        </w:rPr>
+        <w:t>Warrior</w:t>
+      </w:r>
+      <w:r>
+        <w:rPr>
+          <w:rFonts w:ascii="Consolas" w:hAnsi="Consolas" w:cs="Courier New"/>
+          <w:color w:val="666600"/>
+          <w:sz w:val="17"/>
+          <w:szCs w:val="17"/>
+        </w:rPr>
+        <w:t>::</w:t>
+      </w:r>
+      <w:r>
+        <w:rPr>
+          <w:rFonts w:ascii="Consolas" w:hAnsi="Consolas" w:cs="Courier New"/>
+          <w:color w:val="660066"/>
+          <w:sz w:val="17"/>
+          <w:szCs w:val="17"/>
+        </w:rPr>
+        <w:t>Draw</w:t>
+      </w:r>
+      <w:r>
+        <w:rPr>
+          <w:rFonts w:ascii="Consolas" w:hAnsi="Consolas" w:cs="Courier New"/>
+          <w:color w:val="666600"/>
+          <w:sz w:val="17"/>
+          <w:szCs w:val="17"/>
+        </w:rPr>
+        <w:t>(</w:t>
+      </w:r>
+      <w:proofErr w:type="gramEnd"/>
+      <w:r>
+        <w:rPr>
+          <w:rFonts w:ascii="Consolas" w:hAnsi="Consolas" w:cs="Courier New"/>
+          <w:color w:val="666600"/>
+          <w:sz w:val="17"/>
+          <w:szCs w:val="17"/>
+        </w:rPr>
+        <w:t>)</w:t>
+      </w:r>
+      <w:r>
+        <w:rPr>
+          <w:rFonts w:ascii="Consolas" w:hAnsi="Consolas" w:cs="Courier New"/>
+          <w:color w:val="000000"/>
+          <w:sz w:val="17"/>
+          <w:szCs w:val="17"/>
+        </w:rPr>
+        <w:t xml:space="preserve"> </w:t>
+      </w:r>
+      <w:r>
+        <w:rPr>
+          <w:rFonts w:ascii="Consolas" w:hAnsi="Consolas" w:cs="Courier New"/>
+          <w:color w:val="666600"/>
+          <w:sz w:val="17"/>
+          <w:szCs w:val="17"/>
+        </w:rPr>
+        <w:t>{</w:t>
+      </w:r>
+    </w:p>
+    <w:p>
+      <w:pPr>
+        <w:pStyle w:val="NormalWeb"/>
+        <w:pBdr>
+          <w:top w:val="single" w:sz="6" w:space="2" w:color="888888"/>
+          <w:left w:val="single" w:sz="6" w:space="2" w:color="888888"/>
+          <w:bottom w:val="single" w:sz="6" w:space="2" w:color="888888"/>
+          <w:right w:val="single" w:sz="6" w:space="2" w:color="888888"/>
+        </w:pBdr>
+        <w:tabs>
+          <w:tab w:val="left" w:pos="916"/>
+          <w:tab w:val="left" w:pos="1832"/>
+          <w:tab w:val="left" w:pos="2748"/>
+          <w:tab w:val="left" w:pos="3664"/>
+          <w:tab w:val="left" w:pos="4580"/>
+          <w:tab w:val="left" w:pos="5496"/>
+          <w:tab w:val="left" w:pos="6412"/>
+          <w:tab w:val="left" w:pos="7328"/>
+          <w:tab w:val="left" w:pos="8244"/>
+          <w:tab w:val="left" w:pos="9160"/>
+          <w:tab w:val="left" w:pos="10076"/>
+          <w:tab w:val="left" w:pos="10992"/>
+          <w:tab w:val="left" w:pos="11908"/>
+          <w:tab w:val="left" w:pos="12824"/>
+          <w:tab w:val="left" w:pos="13740"/>
+          <w:tab w:val="left" w:pos="14656"/>
+        </w:tabs>
+        <w:spacing w:before="0" w:beforeAutospacing="0" w:after="0" w:afterAutospacing="0"/>
+        <w:divId w:val="1461419437"/>
+        <w:rPr>
+          <w:rFonts w:ascii="Consolas" w:hAnsi="Consolas" w:cs="Courier New"/>
+          <w:sz w:val="17"/>
+          <w:szCs w:val="17"/>
+        </w:rPr>
+      </w:pPr>
+      <w:r>
+        <w:rPr>
+          <w:rFonts w:ascii="Consolas" w:hAnsi="Consolas" w:cs="Courier New"/>
+          <w:sz w:val="17"/>
+          <w:szCs w:val="17"/>
+        </w:rPr>
+        <w:t xml:space="preserve"> 2. </w:t>
+      </w:r>
+      <w:r>
+        <w:rPr>
+          <w:rFonts w:ascii="Consolas" w:hAnsi="Consolas" w:cs="Courier New"/>
+          <w:color w:val="000000"/>
+          <w:sz w:val="17"/>
+          <w:szCs w:val="17"/>
+        </w:rPr>
+        <w:t xml:space="preserve">    </w:t>
+      </w:r>
+      <w:r>
+        <w:rPr>
+          <w:rFonts w:ascii="Consolas" w:hAnsi="Consolas" w:cs="Courier New"/>
+          <w:color w:val="880000"/>
+          <w:sz w:val="17"/>
+          <w:szCs w:val="17"/>
+        </w:rPr>
+        <w:t>// Move and Draw our Warrior</w:t>
+      </w:r>
+    </w:p>
+    <w:p>
+      <w:pPr>
+        <w:pStyle w:val="NormalWeb"/>
+        <w:pBdr>
+          <w:top w:val="single" w:sz="6" w:space="2" w:color="888888"/>
+          <w:left w:val="single" w:sz="6" w:space="2" w:color="888888"/>
+          <w:bottom w:val="single" w:sz="6" w:space="2" w:color="888888"/>
+          <w:right w:val="single" w:sz="6" w:space="2" w:color="888888"/>
+        </w:pBdr>
+        <w:tabs>
+          <w:tab w:val="left" w:pos="916"/>
+          <w:tab w:val="left" w:pos="1832"/>
+          <w:tab w:val="left" w:pos="2748"/>
+          <w:tab w:val="left" w:pos="3664"/>
+          <w:tab w:val="left" w:pos="4580"/>
+          <w:tab w:val="left" w:pos="5496"/>
+          <w:tab w:val="left" w:pos="6412"/>
+          <w:tab w:val="left" w:pos="7328"/>
+          <w:tab w:val="left" w:pos="8244"/>
+          <w:tab w:val="left" w:pos="9160"/>
+          <w:tab w:val="left" w:pos="10076"/>
+          <w:tab w:val="left" w:pos="10992"/>
+          <w:tab w:val="left" w:pos="11908"/>
+          <w:tab w:val="left" w:pos="12824"/>
+          <w:tab w:val="left" w:pos="13740"/>
+          <w:tab w:val="left" w:pos="14656"/>
+        </w:tabs>
+        <w:spacing w:before="0" w:beforeAutospacing="0" w:after="0" w:afterAutospacing="0"/>
+        <w:divId w:val="1461419437"/>
+        <w:rPr>
+          <w:rFonts w:ascii="Consolas" w:hAnsi="Consolas" w:cs="Courier New"/>
+          <w:sz w:val="17"/>
+          <w:szCs w:val="17"/>
+        </w:rPr>
+      </w:pPr>
+      <w:r>
+        <w:rPr>
+          <w:rFonts w:ascii="Consolas" w:hAnsi="Consolas" w:cs="Courier New"/>
+          <w:sz w:val="17"/>
+          <w:szCs w:val="17"/>
+        </w:rPr>
+        <w:t xml:space="preserve"> 3. </w:t>
+      </w:r>
+      <w:r>
+        <w:rPr>
+          <w:rFonts w:ascii="Consolas" w:hAnsi="Consolas" w:cs="Courier New"/>
+          <w:color w:val="000000"/>
+          <w:sz w:val="17"/>
+          <w:szCs w:val="17"/>
+        </w:rPr>
+        <w:t xml:space="preserve">    </w:t>
+      </w:r>
+      <w:proofErr w:type="spellStart"/>
+      <w:r>
+        <w:rPr>
+          <w:rFonts w:ascii="Consolas" w:hAnsi="Consolas" w:cs="Courier New"/>
+          <w:color w:val="000000"/>
+          <w:sz w:val="17"/>
+          <w:szCs w:val="17"/>
+        </w:rPr>
+        <w:t>m_Animation</w:t>
+      </w:r>
+      <w:proofErr w:type="spellEnd"/>
+      <w:r>
+        <w:rPr>
+          <w:rFonts w:ascii="Consolas" w:hAnsi="Consolas" w:cs="Courier New"/>
+          <w:color w:val="666600"/>
+          <w:sz w:val="17"/>
+          <w:szCs w:val="17"/>
+        </w:rPr>
+        <w:t>-&gt;</w:t>
+      </w:r>
+      <w:r>
+        <w:rPr>
+          <w:rFonts w:ascii="Consolas" w:hAnsi="Consolas" w:cs="Courier New"/>
+          <w:color w:val="660066"/>
+          <w:sz w:val="17"/>
+          <w:szCs w:val="17"/>
+        </w:rPr>
+        <w:t>Draw</w:t>
+      </w:r>
+      <w:r>
+        <w:rPr>
+          <w:rFonts w:ascii="Consolas" w:hAnsi="Consolas" w:cs="Courier New"/>
+          <w:color w:val="666600"/>
+          <w:sz w:val="17"/>
+          <w:szCs w:val="17"/>
+        </w:rPr>
+        <w:t>(</w:t>
+      </w:r>
+      <w:proofErr w:type="spellStart"/>
+      <w:r>
+        <w:rPr>
+          <w:rFonts w:ascii="Consolas" w:hAnsi="Consolas" w:cs="Courier New"/>
+          <w:color w:val="000000"/>
+          <w:sz w:val="17"/>
+          <w:szCs w:val="17"/>
+        </w:rPr>
+        <w:t>m_Transform</w:t>
+      </w:r>
+      <w:proofErr w:type="spellEnd"/>
+      <w:r>
+        <w:rPr>
+          <w:rFonts w:ascii="Consolas" w:hAnsi="Consolas" w:cs="Courier New"/>
+          <w:color w:val="666600"/>
+          <w:sz w:val="17"/>
+          <w:szCs w:val="17"/>
+        </w:rPr>
+        <w:t>-&gt;</w:t>
+      </w:r>
+      <w:r>
+        <w:rPr>
+          <w:rFonts w:ascii="Consolas" w:hAnsi="Consolas" w:cs="Courier New"/>
+          <w:color w:val="000000"/>
+          <w:sz w:val="17"/>
+          <w:szCs w:val="17"/>
+        </w:rPr>
+        <w:t>X</w:t>
+      </w:r>
+      <w:r>
+        <w:rPr>
+          <w:rFonts w:ascii="Consolas" w:hAnsi="Consolas" w:cs="Courier New"/>
+          <w:color w:val="666600"/>
+          <w:sz w:val="17"/>
+          <w:szCs w:val="17"/>
+        </w:rPr>
+        <w:t>,</w:t>
+      </w:r>
+      <w:r>
+        <w:rPr>
+          <w:rFonts w:ascii="Consolas" w:hAnsi="Consolas" w:cs="Courier New"/>
+          <w:color w:val="000000"/>
+          <w:sz w:val="17"/>
+          <w:szCs w:val="17"/>
+        </w:rPr>
+        <w:t xml:space="preserve"> </w:t>
+      </w:r>
+      <w:proofErr w:type="spellStart"/>
+      <w:r>
+        <w:rPr>
+          <w:rFonts w:ascii="Consolas" w:hAnsi="Consolas" w:cs="Courier New"/>
+          <w:color w:val="000000"/>
+          <w:sz w:val="17"/>
+          <w:szCs w:val="17"/>
+        </w:rPr>
+        <w:t>m_Transform</w:t>
+      </w:r>
+      <w:proofErr w:type="spellEnd"/>
+      <w:r>
+        <w:rPr>
+          <w:rFonts w:ascii="Consolas" w:hAnsi="Consolas" w:cs="Courier New"/>
+          <w:color w:val="666600"/>
+          <w:sz w:val="17"/>
+          <w:szCs w:val="17"/>
+        </w:rPr>
+        <w:t>-&gt;</w:t>
+      </w:r>
+      <w:r>
+        <w:rPr>
+          <w:rFonts w:ascii="Consolas" w:hAnsi="Consolas" w:cs="Courier New"/>
+          <w:color w:val="000000"/>
+          <w:sz w:val="17"/>
+          <w:szCs w:val="17"/>
+        </w:rPr>
+        <w:t>Y</w:t>
+      </w:r>
+      <w:r>
+        <w:rPr>
+          <w:rFonts w:ascii="Consolas" w:hAnsi="Consolas" w:cs="Courier New"/>
+          <w:color w:val="666600"/>
+          <w:sz w:val="17"/>
+          <w:szCs w:val="17"/>
+        </w:rPr>
+        <w:t>,</w:t>
+      </w:r>
+      <w:r>
+        <w:rPr>
+          <w:rFonts w:ascii="Consolas" w:hAnsi="Consolas" w:cs="Courier New"/>
+          <w:color w:val="000000"/>
+          <w:sz w:val="17"/>
+          <w:szCs w:val="17"/>
+        </w:rPr>
+        <w:t xml:space="preserve"> </w:t>
+      </w:r>
+      <w:proofErr w:type="spellStart"/>
+      <w:r>
+        <w:rPr>
+          <w:rFonts w:ascii="Consolas" w:hAnsi="Consolas" w:cs="Courier New"/>
+          <w:color w:val="000000"/>
+          <w:sz w:val="17"/>
+          <w:szCs w:val="17"/>
+        </w:rPr>
+        <w:t>m_Width</w:t>
+      </w:r>
+      <w:proofErr w:type="spellEnd"/>
+      <w:r>
+        <w:rPr>
+          <w:rFonts w:ascii="Consolas" w:hAnsi="Consolas" w:cs="Courier New"/>
+          <w:color w:val="666600"/>
+          <w:sz w:val="17"/>
+          <w:szCs w:val="17"/>
+        </w:rPr>
+        <w:t>,</w:t>
+      </w:r>
+      <w:r>
+        <w:rPr>
+          <w:rFonts w:ascii="Consolas" w:hAnsi="Consolas" w:cs="Courier New"/>
+          <w:color w:val="000000"/>
+          <w:sz w:val="17"/>
+          <w:szCs w:val="17"/>
+        </w:rPr>
+        <w:t xml:space="preserve"> </w:t>
+      </w:r>
+      <w:proofErr w:type="spellStart"/>
+      <w:r>
+        <w:rPr>
+          <w:rFonts w:ascii="Consolas" w:hAnsi="Consolas" w:cs="Courier New"/>
+          <w:color w:val="000000"/>
+          <w:sz w:val="17"/>
+          <w:szCs w:val="17"/>
+        </w:rPr>
+        <w:t>m_Height</w:t>
+      </w:r>
+      <w:proofErr w:type="spellEnd"/>
+      <w:proofErr w:type="gramStart"/>
+      <w:r>
+        <w:rPr>
+          <w:rFonts w:ascii="Consolas" w:hAnsi="Consolas" w:cs="Courier New"/>
+          <w:color w:val="666600"/>
+          <w:sz w:val="17"/>
+          <w:szCs w:val="17"/>
+        </w:rPr>
+        <w:t>);</w:t>
+      </w:r>
+      <w:proofErr w:type="gramEnd"/>
+    </w:p>
+    <w:p>
+      <w:pPr>
+        <w:pStyle w:val="NormalWeb"/>
+        <w:pBdr>
+          <w:top w:val="single" w:sz="6" w:space="2" w:color="888888"/>
+          <w:left w:val="single" w:sz="6" w:space="2" w:color="888888"/>
+          <w:bottom w:val="single" w:sz="6" w:space="2" w:color="888888"/>
+          <w:right w:val="single" w:sz="6" w:space="2" w:color="888888"/>
+        </w:pBdr>
+        <w:tabs>
+          <w:tab w:val="left" w:pos="916"/>
+          <w:tab w:val="left" w:pos="1832"/>
+          <w:tab w:val="left" w:pos="2748"/>
+          <w:tab w:val="left" w:pos="3664"/>
+          <w:tab w:val="left" w:pos="4580"/>
+          <w:tab w:val="left" w:pos="5496"/>
+          <w:tab w:val="left" w:pos="6412"/>
+          <w:tab w:val="left" w:pos="7328"/>
+          <w:tab w:val="left" w:pos="8244"/>
+          <w:tab w:val="left" w:pos="9160"/>
+          <w:tab w:val="left" w:pos="10076"/>
+          <w:tab w:val="left" w:pos="10992"/>
+          <w:tab w:val="left" w:pos="11908"/>
+          <w:tab w:val="left" w:pos="12824"/>
+          <w:tab w:val="left" w:pos="13740"/>
+          <w:tab w:val="left" w:pos="14656"/>
+        </w:tabs>
+        <w:spacing w:before="0" w:beforeAutospacing="0" w:after="0" w:afterAutospacing="0"/>
+        <w:divId w:val="1461419437"/>
+        <w:rPr>
+          <w:rFonts w:ascii="Consolas" w:hAnsi="Consolas" w:cs="Courier New"/>
+          <w:sz w:val="17"/>
+          <w:szCs w:val="17"/>
+        </w:rPr>
+      </w:pPr>
+      <w:r>
+        <w:rPr>
+          <w:rFonts w:ascii="Consolas" w:hAnsi="Consolas" w:cs="Courier New"/>
+          <w:sz w:val="17"/>
+          <w:szCs w:val="17"/>
+        </w:rPr>
+        <w:t xml:space="preserve"> 4. </w:t>
+      </w:r>
+      <w:r>
+        <w:rPr>
+          <w:rFonts w:ascii="Consolas" w:hAnsi="Consolas" w:cs="Courier New"/>
+          <w:color w:val="000000"/>
+          <w:sz w:val="17"/>
+          <w:szCs w:val="17"/>
+        </w:rPr>
+        <w:t> </w:t>
+      </w:r>
+    </w:p>
+    <w:p>
+      <w:pPr>
+        <w:pStyle w:val="NormalWeb"/>
+        <w:pBdr>
+          <w:top w:val="single" w:sz="6" w:space="2" w:color="888888"/>
+          <w:left w:val="single" w:sz="6" w:space="2" w:color="888888"/>
+          <w:bottom w:val="single" w:sz="6" w:space="2" w:color="888888"/>
+          <w:right w:val="single" w:sz="6" w:space="2" w:color="888888"/>
+        </w:pBdr>
+        <w:tabs>
+          <w:tab w:val="left" w:pos="916"/>
+          <w:tab w:val="left" w:pos="1832"/>
+          <w:tab w:val="left" w:pos="2748"/>
+          <w:tab w:val="left" w:pos="3664"/>
+          <w:tab w:val="left" w:pos="4580"/>
+          <w:tab w:val="left" w:pos="5496"/>
+          <w:tab w:val="left" w:pos="6412"/>
+          <w:tab w:val="left" w:pos="7328"/>
+          <w:tab w:val="left" w:pos="8244"/>
+          <w:tab w:val="left" w:pos="9160"/>
+          <w:tab w:val="left" w:pos="10076"/>
+          <w:tab w:val="left" w:pos="10992"/>
+          <w:tab w:val="left" w:pos="11908"/>
+          <w:tab w:val="left" w:pos="12824"/>
+          <w:tab w:val="left" w:pos="13740"/>
+          <w:tab w:val="left" w:pos="14656"/>
+        </w:tabs>
+        <w:spacing w:before="0" w:beforeAutospacing="0" w:after="0" w:afterAutospacing="0"/>
+        <w:divId w:val="1461419437"/>
+        <w:rPr>
+          <w:rFonts w:ascii="Consolas" w:hAnsi="Consolas" w:cs="Courier New"/>
+          <w:sz w:val="17"/>
+          <w:szCs w:val="17"/>
+        </w:rPr>
+      </w:pPr>
+      <w:r>
+        <w:rPr>
+          <w:rFonts w:ascii="Consolas" w:hAnsi="Consolas" w:cs="Courier New"/>
+          <w:sz w:val="17"/>
+          <w:szCs w:val="17"/>
+        </w:rPr>
+        <w:t xml:space="preserve"> 5. </w:t>
+      </w:r>
+      <w:r>
+        <w:rPr>
+          <w:rFonts w:ascii="Consolas" w:hAnsi="Consolas" w:cs="Courier New"/>
+          <w:color w:val="000000"/>
+          <w:sz w:val="17"/>
+          <w:szCs w:val="17"/>
+        </w:rPr>
+        <w:t xml:space="preserve">    </w:t>
+      </w:r>
+      <w:r>
+        <w:rPr>
+          <w:rFonts w:ascii="Consolas" w:hAnsi="Consolas" w:cs="Courier New"/>
+          <w:color w:val="880000"/>
+          <w:sz w:val="17"/>
+          <w:szCs w:val="17"/>
+        </w:rPr>
+        <w:t>// Create an artificial box around our Warrior (temporary)</w:t>
+      </w:r>
+    </w:p>
+    <w:p>
+      <w:pPr>
+        <w:pStyle w:val="NormalWeb"/>
+        <w:pBdr>
+          <w:top w:val="single" w:sz="6" w:space="2" w:color="888888"/>
+          <w:left w:val="single" w:sz="6" w:space="2" w:color="888888"/>
+          <w:bottom w:val="single" w:sz="6" w:space="2" w:color="888888"/>
+          <w:right w:val="single" w:sz="6" w:space="2" w:color="888888"/>
+        </w:pBdr>
+        <w:tabs>
+          <w:tab w:val="left" w:pos="916"/>
+          <w:tab w:val="left" w:pos="1832"/>
+          <w:tab w:val="left" w:pos="2748"/>
+          <w:tab w:val="left" w:pos="3664"/>
+          <w:tab w:val="left" w:pos="4580"/>
+          <w:tab w:val="left" w:pos="5496"/>
+          <w:tab w:val="left" w:pos="6412"/>
+          <w:tab w:val="left" w:pos="7328"/>
+          <w:tab w:val="left" w:pos="8244"/>
+          <w:tab w:val="left" w:pos="9160"/>
+          <w:tab w:val="left" w:pos="10076"/>
+          <w:tab w:val="left" w:pos="10992"/>
+          <w:tab w:val="left" w:pos="11908"/>
+          <w:tab w:val="left" w:pos="12824"/>
+          <w:tab w:val="left" w:pos="13740"/>
+          <w:tab w:val="left" w:pos="14656"/>
+        </w:tabs>
+        <w:spacing w:before="0" w:beforeAutospacing="0" w:after="0" w:afterAutospacing="0"/>
+        <w:divId w:val="1461419437"/>
+        <w:rPr>
+          <w:rFonts w:ascii="Consolas" w:hAnsi="Consolas" w:cs="Courier New"/>
+          <w:sz w:val="17"/>
+          <w:szCs w:val="17"/>
+        </w:rPr>
+      </w:pPr>
+      <w:r>
+        <w:rPr>
+          <w:rFonts w:ascii="Consolas" w:hAnsi="Consolas" w:cs="Courier New"/>
+          <w:sz w:val="17"/>
+          <w:szCs w:val="17"/>
+        </w:rPr>
+        <w:t xml:space="preserve"> 6. </w:t>
+      </w:r>
+      <w:r>
+        <w:rPr>
+          <w:rFonts w:ascii="Consolas" w:hAnsi="Consolas" w:cs="Courier New"/>
+          <w:color w:val="000000"/>
+          <w:sz w:val="17"/>
+          <w:szCs w:val="17"/>
+        </w:rPr>
+        <w:t xml:space="preserve">    </w:t>
+      </w:r>
+      <w:r>
+        <w:rPr>
+          <w:rFonts w:ascii="Consolas" w:hAnsi="Consolas" w:cs="Courier New"/>
+          <w:color w:val="660066"/>
+          <w:sz w:val="17"/>
+          <w:szCs w:val="17"/>
+        </w:rPr>
+        <w:t>Vector2D</w:t>
+      </w:r>
+      <w:r>
+        <w:rPr>
+          <w:rFonts w:ascii="Consolas" w:hAnsi="Consolas" w:cs="Courier New"/>
+          <w:color w:val="000000"/>
+          <w:sz w:val="17"/>
+          <w:szCs w:val="17"/>
+        </w:rPr>
+        <w:t xml:space="preserve"> cam </w:t>
+      </w:r>
+      <w:r>
+        <w:rPr>
+          <w:rFonts w:ascii="Consolas" w:hAnsi="Consolas" w:cs="Courier New"/>
+          <w:color w:val="666600"/>
+          <w:sz w:val="17"/>
+          <w:szCs w:val="17"/>
+        </w:rPr>
+        <w:t>=</w:t>
+      </w:r>
+      <w:r>
+        <w:rPr>
+          <w:rFonts w:ascii="Consolas" w:hAnsi="Consolas" w:cs="Courier New"/>
+          <w:color w:val="000000"/>
+          <w:sz w:val="17"/>
+          <w:szCs w:val="17"/>
+        </w:rPr>
+        <w:t xml:space="preserve"> </w:t>
+      </w:r>
+      <w:proofErr w:type="gramStart"/>
+      <w:r>
+        <w:rPr>
+          <w:rFonts w:ascii="Consolas" w:hAnsi="Consolas" w:cs="Courier New"/>
+          <w:color w:val="660066"/>
+          <w:sz w:val="17"/>
+          <w:szCs w:val="17"/>
+        </w:rPr>
+        <w:t>Camera</w:t>
+      </w:r>
+      <w:r>
+        <w:rPr>
+          <w:rFonts w:ascii="Consolas" w:hAnsi="Consolas" w:cs="Courier New"/>
+          <w:color w:val="666600"/>
+          <w:sz w:val="17"/>
+          <w:szCs w:val="17"/>
+        </w:rPr>
+        <w:t>::</w:t>
+      </w:r>
+      <w:proofErr w:type="spellStart"/>
+      <w:proofErr w:type="gramEnd"/>
+      <w:r>
+        <w:rPr>
+          <w:rFonts w:ascii="Consolas" w:hAnsi="Consolas" w:cs="Courier New"/>
+          <w:color w:val="660066"/>
+          <w:sz w:val="17"/>
+          <w:szCs w:val="17"/>
+        </w:rPr>
+        <w:t>GetInstance</w:t>
+      </w:r>
+      <w:proofErr w:type="spellEnd"/>
+      <w:r>
+        <w:rPr>
+          <w:rFonts w:ascii="Consolas" w:hAnsi="Consolas" w:cs="Courier New"/>
+          <w:color w:val="666600"/>
+          <w:sz w:val="17"/>
+          <w:szCs w:val="17"/>
+        </w:rPr>
+        <w:t>()-&gt;</w:t>
+      </w:r>
+      <w:proofErr w:type="spellStart"/>
+      <w:proofErr w:type="gramStart"/>
+      <w:r>
+        <w:rPr>
+          <w:rFonts w:ascii="Consolas" w:hAnsi="Consolas" w:cs="Courier New"/>
+          <w:color w:val="660066"/>
+          <w:sz w:val="17"/>
+          <w:szCs w:val="17"/>
+        </w:rPr>
+        <w:t>GetPosition</w:t>
+      </w:r>
+      <w:proofErr w:type="spellEnd"/>
+      <w:r>
+        <w:rPr>
+          <w:rFonts w:ascii="Consolas" w:hAnsi="Consolas" w:cs="Courier New"/>
+          <w:color w:val="666600"/>
+          <w:sz w:val="17"/>
+          <w:szCs w:val="17"/>
+        </w:rPr>
+        <w:t>();</w:t>
+      </w:r>
+      <w:proofErr w:type="gramEnd"/>
+    </w:p>
+    <w:p>
+      <w:pPr>
+        <w:pStyle w:val="NormalWeb"/>
+        <w:pBdr>
+          <w:top w:val="single" w:sz="6" w:space="2" w:color="888888"/>
+          <w:left w:val="single" w:sz="6" w:space="2" w:color="888888"/>
+          <w:bottom w:val="single" w:sz="6" w:space="2" w:color="888888"/>
+          <w:right w:val="single" w:sz="6" w:space="2" w:color="888888"/>
+        </w:pBdr>
+        <w:tabs>
+          <w:tab w:val="left" w:pos="916"/>
+          <w:tab w:val="left" w:pos="1832"/>
+          <w:tab w:val="left" w:pos="2748"/>
+          <w:tab w:val="left" w:pos="3664"/>
+          <w:tab w:val="left" w:pos="4580"/>
+          <w:tab w:val="left" w:pos="5496"/>
+          <w:tab w:val="left" w:pos="6412"/>
+          <w:tab w:val="left" w:pos="7328"/>
+          <w:tab w:val="left" w:pos="8244"/>
+          <w:tab w:val="left" w:pos="9160"/>
+          <w:tab w:val="left" w:pos="10076"/>
+          <w:tab w:val="left" w:pos="10992"/>
+          <w:tab w:val="left" w:pos="11908"/>
+          <w:tab w:val="left" w:pos="12824"/>
+          <w:tab w:val="left" w:pos="13740"/>
+          <w:tab w:val="left" w:pos="14656"/>
+        </w:tabs>
+        <w:spacing w:before="0" w:beforeAutospacing="0" w:after="0" w:afterAutospacing="0"/>
+        <w:divId w:val="1461419437"/>
+        <w:rPr>
+          <w:rFonts w:ascii="Consolas" w:hAnsi="Consolas" w:cs="Courier New"/>
+          <w:sz w:val="17"/>
+          <w:szCs w:val="17"/>
+        </w:rPr>
+      </w:pPr>
+      <w:r>
+        <w:rPr>
+          <w:rFonts w:ascii="Consolas" w:hAnsi="Consolas" w:cs="Courier New"/>
+          <w:sz w:val="17"/>
+          <w:szCs w:val="17"/>
+        </w:rPr>
+        <w:t xml:space="preserve"> 7. </w:t>
+      </w:r>
+      <w:r>
+        <w:rPr>
+          <w:rFonts w:ascii="Consolas" w:hAnsi="Consolas" w:cs="Courier New"/>
+          <w:color w:val="000000"/>
+          <w:sz w:val="17"/>
+          <w:szCs w:val="17"/>
+        </w:rPr>
+        <w:t xml:space="preserve">    </w:t>
+      </w:r>
+      <w:proofErr w:type="spellStart"/>
+      <w:r>
+        <w:rPr>
+          <w:rFonts w:ascii="Consolas" w:hAnsi="Consolas" w:cs="Courier New"/>
+          <w:color w:val="000000"/>
+          <w:sz w:val="17"/>
+          <w:szCs w:val="17"/>
+        </w:rPr>
+        <w:t>SDL_Rect</w:t>
+      </w:r>
+      <w:proofErr w:type="spellEnd"/>
+      <w:r>
+        <w:rPr>
+          <w:rFonts w:ascii="Consolas" w:hAnsi="Consolas" w:cs="Courier New"/>
+          <w:color w:val="000000"/>
+          <w:sz w:val="17"/>
+          <w:szCs w:val="17"/>
+        </w:rPr>
+        <w:t xml:space="preserve"> box </w:t>
+      </w:r>
+      <w:r>
+        <w:rPr>
+          <w:rFonts w:ascii="Consolas" w:hAnsi="Consolas" w:cs="Courier New"/>
+          <w:color w:val="666600"/>
+          <w:sz w:val="17"/>
+          <w:szCs w:val="17"/>
+        </w:rPr>
+        <w:t>=</w:t>
+      </w:r>
+      <w:r>
+        <w:rPr>
+          <w:rFonts w:ascii="Consolas" w:hAnsi="Consolas" w:cs="Courier New"/>
+          <w:color w:val="000000"/>
+          <w:sz w:val="17"/>
+          <w:szCs w:val="17"/>
+        </w:rPr>
+        <w:t xml:space="preserve"> </w:t>
+      </w:r>
+      <w:proofErr w:type="spellStart"/>
+      <w:r>
+        <w:rPr>
+          <w:rFonts w:ascii="Consolas" w:hAnsi="Consolas" w:cs="Courier New"/>
+          <w:color w:val="000000"/>
+          <w:sz w:val="17"/>
+          <w:szCs w:val="17"/>
+        </w:rPr>
+        <w:t>m_Collider</w:t>
+      </w:r>
+      <w:proofErr w:type="spellEnd"/>
+      <w:r>
+        <w:rPr>
+          <w:rFonts w:ascii="Consolas" w:hAnsi="Consolas" w:cs="Courier New"/>
+          <w:color w:val="666600"/>
+          <w:sz w:val="17"/>
+          <w:szCs w:val="17"/>
+        </w:rPr>
+        <w:t>-&gt;</w:t>
+      </w:r>
+      <w:proofErr w:type="gramStart"/>
+      <w:r>
+        <w:rPr>
+          <w:rFonts w:ascii="Consolas" w:hAnsi="Consolas" w:cs="Courier New"/>
+          <w:color w:val="660066"/>
+          <w:sz w:val="17"/>
+          <w:szCs w:val="17"/>
+        </w:rPr>
+        <w:t>Get</w:t>
+      </w:r>
+      <w:r>
+        <w:rPr>
+          <w:rFonts w:ascii="Consolas" w:hAnsi="Consolas" w:cs="Courier New"/>
+          <w:color w:val="666600"/>
+          <w:sz w:val="17"/>
+          <w:szCs w:val="17"/>
+        </w:rPr>
+        <w:t>();</w:t>
+      </w:r>
+      <w:r>
+        <w:rPr>
+          <w:rFonts w:ascii="Consolas" w:hAnsi="Consolas" w:cs="Courier New"/>
+          <w:color w:val="000000"/>
+          <w:sz w:val="17"/>
+          <w:szCs w:val="17"/>
+        </w:rPr>
+        <w:t xml:space="preserve">   </w:t>
+      </w:r>
+      <w:proofErr w:type="gramEnd"/>
+      <w:r>
+        <w:rPr>
+          <w:rFonts w:ascii="Consolas" w:hAnsi="Consolas" w:cs="Courier New"/>
+          <w:color w:val="880000"/>
+          <w:sz w:val="17"/>
+          <w:szCs w:val="17"/>
+        </w:rPr>
+        <w:t>// get the Warrior's collider box</w:t>
+      </w:r>
+    </w:p>
+    <w:p>
+      <w:pPr>
+        <w:pStyle w:val="NormalWeb"/>
+        <w:pBdr>
+          <w:top w:val="single" w:sz="6" w:space="2" w:color="888888"/>
+          <w:left w:val="single" w:sz="6" w:space="2" w:color="888888"/>
+          <w:bottom w:val="single" w:sz="6" w:space="2" w:color="888888"/>
+          <w:right w:val="single" w:sz="6" w:space="2" w:color="888888"/>
+        </w:pBdr>
+        <w:tabs>
+          <w:tab w:val="left" w:pos="916"/>
+          <w:tab w:val="left" w:pos="1832"/>
+          <w:tab w:val="left" w:pos="2748"/>
+          <w:tab w:val="left" w:pos="3664"/>
+          <w:tab w:val="left" w:pos="4580"/>
+          <w:tab w:val="left" w:pos="5496"/>
+          <w:tab w:val="left" w:pos="6412"/>
+          <w:tab w:val="left" w:pos="7328"/>
+          <w:tab w:val="left" w:pos="8244"/>
+          <w:tab w:val="left" w:pos="9160"/>
+          <w:tab w:val="left" w:pos="10076"/>
+          <w:tab w:val="left" w:pos="10992"/>
+          <w:tab w:val="left" w:pos="11908"/>
+          <w:tab w:val="left" w:pos="12824"/>
+          <w:tab w:val="left" w:pos="13740"/>
+          <w:tab w:val="left" w:pos="14656"/>
+        </w:tabs>
+        <w:spacing w:before="0" w:beforeAutospacing="0" w:after="0" w:afterAutospacing="0"/>
+        <w:divId w:val="1461419437"/>
+        <w:rPr>
+          <w:rFonts w:ascii="Consolas" w:hAnsi="Consolas" w:cs="Courier New"/>
+          <w:sz w:val="17"/>
+          <w:szCs w:val="17"/>
+        </w:rPr>
+      </w:pPr>
+      <w:r>
+        <w:rPr>
+          <w:rFonts w:ascii="Consolas" w:hAnsi="Consolas" w:cs="Courier New"/>
+          <w:sz w:val="17"/>
+          <w:szCs w:val="17"/>
+        </w:rPr>
+        <w:t xml:space="preserve"> 8. </w:t>
+      </w:r>
+      <w:r>
+        <w:rPr>
+          <w:rFonts w:ascii="Consolas" w:hAnsi="Consolas" w:cs="Courier New"/>
+          <w:color w:val="000000"/>
+          <w:sz w:val="17"/>
+          <w:szCs w:val="17"/>
+        </w:rPr>
+        <w:t> </w:t>
+      </w:r>
+    </w:p>
+    <w:p>
+      <w:pPr>
+        <w:pStyle w:val="NormalWeb"/>
+        <w:pBdr>
+          <w:top w:val="single" w:sz="6" w:space="2" w:color="888888"/>
+          <w:left w:val="single" w:sz="6" w:space="2" w:color="888888"/>
+          <w:bottom w:val="single" w:sz="6" w:space="2" w:color="888888"/>
+          <w:right w:val="single" w:sz="6" w:space="2" w:color="888888"/>
+        </w:pBdr>
+        <w:tabs>
+          <w:tab w:val="left" w:pos="916"/>
+          <w:tab w:val="left" w:pos="1832"/>
+          <w:tab w:val="left" w:pos="2748"/>
+          <w:tab w:val="left" w:pos="3664"/>
+          <w:tab w:val="left" w:pos="4580"/>
+          <w:tab w:val="left" w:pos="5496"/>
+          <w:tab w:val="left" w:pos="6412"/>
+          <w:tab w:val="left" w:pos="7328"/>
+          <w:tab w:val="left" w:pos="8244"/>
+          <w:tab w:val="left" w:pos="9160"/>
+          <w:tab w:val="left" w:pos="10076"/>
+          <w:tab w:val="left" w:pos="10992"/>
+          <w:tab w:val="left" w:pos="11908"/>
+          <w:tab w:val="left" w:pos="12824"/>
+          <w:tab w:val="left" w:pos="13740"/>
+          <w:tab w:val="left" w:pos="14656"/>
+        </w:tabs>
+        <w:spacing w:before="0" w:beforeAutospacing="0" w:after="0" w:afterAutospacing="0"/>
+        <w:divId w:val="1461419437"/>
+        <w:rPr>
+          <w:rFonts w:ascii="Consolas" w:hAnsi="Consolas" w:cs="Courier New"/>
+          <w:sz w:val="17"/>
+          <w:szCs w:val="17"/>
+        </w:rPr>
+      </w:pPr>
+      <w:r>
+        <w:rPr>
+          <w:rFonts w:ascii="Consolas" w:hAnsi="Consolas" w:cs="Courier New"/>
+          <w:sz w:val="17"/>
+          <w:szCs w:val="17"/>
+        </w:rPr>
+        <w:t xml:space="preserve"> 9. </w:t>
+      </w:r>
+      <w:r>
+        <w:rPr>
+          <w:rFonts w:ascii="Consolas" w:hAnsi="Consolas" w:cs="Courier New"/>
+          <w:color w:val="000000"/>
+          <w:sz w:val="17"/>
+          <w:szCs w:val="17"/>
+        </w:rPr>
+        <w:t xml:space="preserve">    </w:t>
+      </w:r>
+      <w:r>
+        <w:rPr>
+          <w:rFonts w:ascii="Consolas" w:hAnsi="Consolas" w:cs="Courier New"/>
+          <w:color w:val="880000"/>
+          <w:sz w:val="17"/>
+          <w:szCs w:val="17"/>
+        </w:rPr>
+        <w:t>// Make sure the collider box is adjusted to follow the Warrior</w:t>
+      </w:r>
+    </w:p>
+    <w:p>
+      <w:pPr>
+        <w:pStyle w:val="NormalWeb"/>
+        <w:pBdr>
+          <w:top w:val="single" w:sz="6" w:space="2" w:color="888888"/>
+          <w:left w:val="single" w:sz="6" w:space="2" w:color="888888"/>
+          <w:bottom w:val="single" w:sz="6" w:space="2" w:color="888888"/>
+          <w:right w:val="single" w:sz="6" w:space="2" w:color="888888"/>
+        </w:pBdr>
+        <w:tabs>
+          <w:tab w:val="left" w:pos="916"/>
+          <w:tab w:val="left" w:pos="1832"/>
+          <w:tab w:val="left" w:pos="2748"/>
+          <w:tab w:val="left" w:pos="3664"/>
+          <w:tab w:val="left" w:pos="4580"/>
+          <w:tab w:val="left" w:pos="5496"/>
+          <w:tab w:val="left" w:pos="6412"/>
+          <w:tab w:val="left" w:pos="7328"/>
+          <w:tab w:val="left" w:pos="8244"/>
+          <w:tab w:val="left" w:pos="9160"/>
+          <w:tab w:val="left" w:pos="10076"/>
+          <w:tab w:val="left" w:pos="10992"/>
+          <w:tab w:val="left" w:pos="11908"/>
+          <w:tab w:val="left" w:pos="12824"/>
+          <w:tab w:val="left" w:pos="13740"/>
+          <w:tab w:val="left" w:pos="14656"/>
+        </w:tabs>
+        <w:spacing w:before="0" w:beforeAutospacing="0" w:after="0" w:afterAutospacing="0"/>
+        <w:divId w:val="1461419437"/>
+        <w:rPr>
+          <w:rFonts w:ascii="Consolas" w:hAnsi="Consolas" w:cs="Courier New"/>
+          <w:sz w:val="17"/>
+          <w:szCs w:val="17"/>
+        </w:rPr>
+      </w:pPr>
+      <w:r>
+        <w:rPr>
+          <w:rFonts w:ascii="Consolas" w:hAnsi="Consolas" w:cs="Courier New"/>
+          <w:sz w:val="17"/>
+          <w:szCs w:val="17"/>
+        </w:rPr>
+        <w:t xml:space="preserve">10. </w:t>
+      </w:r>
+      <w:r>
+        <w:rPr>
+          <w:rFonts w:ascii="Consolas" w:hAnsi="Consolas" w:cs="Courier New"/>
+          <w:color w:val="000000"/>
+          <w:sz w:val="17"/>
+          <w:szCs w:val="17"/>
+        </w:rPr>
+        <w:t xml:space="preserve">    </w:t>
+      </w:r>
+      <w:proofErr w:type="spellStart"/>
+      <w:r>
+        <w:rPr>
+          <w:rFonts w:ascii="Consolas" w:hAnsi="Consolas" w:cs="Courier New"/>
+          <w:color w:val="000000"/>
+          <w:sz w:val="17"/>
+          <w:szCs w:val="17"/>
+        </w:rPr>
+        <w:t>box</w:t>
+      </w:r>
+      <w:r>
+        <w:rPr>
+          <w:rFonts w:ascii="Consolas" w:hAnsi="Consolas" w:cs="Courier New"/>
+          <w:color w:val="666600"/>
+          <w:sz w:val="17"/>
+          <w:szCs w:val="17"/>
+        </w:rPr>
+        <w:t>.</w:t>
+      </w:r>
+      <w:r>
+        <w:rPr>
+          <w:rFonts w:ascii="Consolas" w:hAnsi="Consolas" w:cs="Courier New"/>
+          <w:color w:val="000000"/>
+          <w:sz w:val="17"/>
+          <w:szCs w:val="17"/>
+        </w:rPr>
+        <w:t>x</w:t>
+      </w:r>
+      <w:proofErr w:type="spellEnd"/>
+      <w:r>
+        <w:rPr>
+          <w:rFonts w:ascii="Consolas" w:hAnsi="Consolas" w:cs="Courier New"/>
+          <w:color w:val="000000"/>
+          <w:sz w:val="17"/>
+          <w:szCs w:val="17"/>
+        </w:rPr>
+        <w:t xml:space="preserve"> </w:t>
+      </w:r>
+      <w:r>
+        <w:rPr>
+          <w:rFonts w:ascii="Consolas" w:hAnsi="Consolas" w:cs="Courier New"/>
+          <w:color w:val="666600"/>
+          <w:sz w:val="17"/>
+          <w:szCs w:val="17"/>
+        </w:rPr>
+        <w:t>-=</w:t>
+      </w:r>
+      <w:r>
+        <w:rPr>
+          <w:rFonts w:ascii="Consolas" w:hAnsi="Consolas" w:cs="Courier New"/>
+          <w:color w:val="000000"/>
+          <w:sz w:val="17"/>
+          <w:szCs w:val="17"/>
+        </w:rPr>
+        <w:t xml:space="preserve"> </w:t>
+      </w:r>
+      <w:proofErr w:type="spellStart"/>
+      <w:r>
+        <w:rPr>
+          <w:rFonts w:ascii="Consolas" w:hAnsi="Consolas" w:cs="Courier New"/>
+          <w:color w:val="000000"/>
+          <w:sz w:val="17"/>
+          <w:szCs w:val="17"/>
+        </w:rPr>
+        <w:t>cam</w:t>
+      </w:r>
+      <w:r>
+        <w:rPr>
+          <w:rFonts w:ascii="Consolas" w:hAnsi="Consolas" w:cs="Courier New"/>
+          <w:color w:val="666600"/>
+          <w:sz w:val="17"/>
+          <w:szCs w:val="17"/>
+        </w:rPr>
+        <w:t>.</w:t>
+      </w:r>
+      <w:proofErr w:type="gramStart"/>
+      <w:r>
+        <w:rPr>
+          <w:rFonts w:ascii="Consolas" w:hAnsi="Consolas" w:cs="Courier New"/>
+          <w:color w:val="000000"/>
+          <w:sz w:val="17"/>
+          <w:szCs w:val="17"/>
+        </w:rPr>
+        <w:t>X</w:t>
+      </w:r>
+      <w:proofErr w:type="spellEnd"/>
+      <w:r>
+        <w:rPr>
+          <w:rFonts w:ascii="Consolas" w:hAnsi="Consolas" w:cs="Courier New"/>
+          <w:color w:val="666600"/>
+          <w:sz w:val="17"/>
+          <w:szCs w:val="17"/>
+        </w:rPr>
+        <w:t>;</w:t>
+      </w:r>
+      <w:proofErr w:type="gramEnd"/>
+    </w:p>
+    <w:p>
+      <w:pPr>
+        <w:pStyle w:val="NormalWeb"/>
+        <w:pBdr>
+          <w:top w:val="single" w:sz="6" w:space="2" w:color="888888"/>
+          <w:left w:val="single" w:sz="6" w:space="2" w:color="888888"/>
+          <w:bottom w:val="single" w:sz="6" w:space="2" w:color="888888"/>
+          <w:right w:val="single" w:sz="6" w:space="2" w:color="888888"/>
+        </w:pBdr>
+        <w:tabs>
+          <w:tab w:val="left" w:pos="916"/>
+          <w:tab w:val="left" w:pos="1832"/>
+          <w:tab w:val="left" w:pos="2748"/>
+          <w:tab w:val="left" w:pos="3664"/>
+          <w:tab w:val="left" w:pos="4580"/>
+          <w:tab w:val="left" w:pos="5496"/>
+          <w:tab w:val="left" w:pos="6412"/>
+          <w:tab w:val="left" w:pos="7328"/>
+          <w:tab w:val="left" w:pos="8244"/>
+          <w:tab w:val="left" w:pos="9160"/>
+          <w:tab w:val="left" w:pos="10076"/>
+          <w:tab w:val="left" w:pos="10992"/>
+          <w:tab w:val="left" w:pos="11908"/>
+          <w:tab w:val="left" w:pos="12824"/>
+          <w:tab w:val="left" w:pos="13740"/>
+          <w:tab w:val="left" w:pos="14656"/>
+        </w:tabs>
+        <w:spacing w:before="0" w:beforeAutospacing="0" w:after="0" w:afterAutospacing="0"/>
+        <w:divId w:val="1461419437"/>
+        <w:rPr>
+          <w:rFonts w:ascii="Consolas" w:hAnsi="Consolas" w:cs="Courier New"/>
+          <w:sz w:val="17"/>
+          <w:szCs w:val="17"/>
+        </w:rPr>
+      </w:pPr>
+      <w:r>
+        <w:rPr>
+          <w:rFonts w:ascii="Consolas" w:hAnsi="Consolas" w:cs="Courier New"/>
+          <w:sz w:val="17"/>
+          <w:szCs w:val="17"/>
+        </w:rPr>
+        <w:t xml:space="preserve">11. </w:t>
+      </w:r>
+      <w:r>
+        <w:rPr>
+          <w:rFonts w:ascii="Consolas" w:hAnsi="Consolas" w:cs="Courier New"/>
+          <w:color w:val="000000"/>
+          <w:sz w:val="17"/>
+          <w:szCs w:val="17"/>
+        </w:rPr>
+        <w:t xml:space="preserve">    </w:t>
+      </w:r>
+      <w:proofErr w:type="spellStart"/>
+      <w:proofErr w:type="gramStart"/>
+      <w:r>
+        <w:rPr>
+          <w:rFonts w:ascii="Consolas" w:hAnsi="Consolas" w:cs="Courier New"/>
+          <w:color w:val="000000"/>
+          <w:sz w:val="17"/>
+          <w:szCs w:val="17"/>
+        </w:rPr>
+        <w:t>box</w:t>
+      </w:r>
+      <w:r>
+        <w:rPr>
+          <w:rFonts w:ascii="Consolas" w:hAnsi="Consolas" w:cs="Courier New"/>
+          <w:color w:val="666600"/>
+          <w:sz w:val="17"/>
+          <w:szCs w:val="17"/>
+        </w:rPr>
+        <w:t>.</w:t>
+      </w:r>
+      <w:r>
+        <w:rPr>
+          <w:rFonts w:ascii="Consolas" w:hAnsi="Consolas" w:cs="Courier New"/>
+          <w:color w:val="000000"/>
+          <w:sz w:val="17"/>
+          <w:szCs w:val="17"/>
+        </w:rPr>
+        <w:t>y</w:t>
+      </w:r>
+      <w:proofErr w:type="spellEnd"/>
+      <w:proofErr w:type="gramEnd"/>
+      <w:r>
+        <w:rPr>
+          <w:rFonts w:ascii="Consolas" w:hAnsi="Consolas" w:cs="Courier New"/>
+          <w:color w:val="000000"/>
+          <w:sz w:val="17"/>
+          <w:szCs w:val="17"/>
+        </w:rPr>
+        <w:t xml:space="preserve"> </w:t>
+      </w:r>
+      <w:r>
+        <w:rPr>
+          <w:rFonts w:ascii="Consolas" w:hAnsi="Consolas" w:cs="Courier New"/>
+          <w:color w:val="666600"/>
+          <w:sz w:val="17"/>
+          <w:szCs w:val="17"/>
+        </w:rPr>
+        <w:t>-=</w:t>
+      </w:r>
+      <w:r>
+        <w:rPr>
+          <w:rFonts w:ascii="Consolas" w:hAnsi="Consolas" w:cs="Courier New"/>
+          <w:color w:val="000000"/>
+          <w:sz w:val="17"/>
+          <w:szCs w:val="17"/>
+        </w:rPr>
+        <w:t xml:space="preserve"> </w:t>
+      </w:r>
+      <w:proofErr w:type="spellStart"/>
+      <w:proofErr w:type="gramStart"/>
+      <w:r>
+        <w:rPr>
+          <w:rFonts w:ascii="Consolas" w:hAnsi="Consolas" w:cs="Courier New"/>
+          <w:color w:val="000000"/>
+          <w:sz w:val="17"/>
+          <w:szCs w:val="17"/>
+        </w:rPr>
+        <w:t>cam</w:t>
+      </w:r>
+      <w:r>
+        <w:rPr>
+          <w:rFonts w:ascii="Consolas" w:hAnsi="Consolas" w:cs="Courier New"/>
+          <w:color w:val="666600"/>
+          <w:sz w:val="17"/>
+          <w:szCs w:val="17"/>
+        </w:rPr>
+        <w:t>.</w:t>
+      </w:r>
+      <w:r>
+        <w:rPr>
+          <w:rFonts w:ascii="Consolas" w:hAnsi="Consolas" w:cs="Courier New"/>
+          <w:color w:val="000000"/>
+          <w:sz w:val="17"/>
+          <w:szCs w:val="17"/>
+        </w:rPr>
+        <w:t>Y</w:t>
+      </w:r>
+      <w:proofErr w:type="spellEnd"/>
+      <w:proofErr w:type="gramEnd"/>
+      <w:r>
+        <w:rPr>
+          <w:rFonts w:ascii="Consolas" w:hAnsi="Consolas" w:cs="Courier New"/>
+          <w:color w:val="666600"/>
+          <w:sz w:val="17"/>
+          <w:szCs w:val="17"/>
+        </w:rPr>
+        <w:t>;</w:t>
+      </w:r>
+    </w:p>
+    <w:p>
+      <w:pPr>
+        <w:pStyle w:val="NormalWeb"/>
+        <w:pBdr>
+          <w:top w:val="single" w:sz="6" w:space="2" w:color="888888"/>
+          <w:left w:val="single" w:sz="6" w:space="2" w:color="888888"/>
+          <w:bottom w:val="single" w:sz="6" w:space="2" w:color="888888"/>
+          <w:right w:val="single" w:sz="6" w:space="2" w:color="888888"/>
+        </w:pBdr>
+        <w:tabs>
+          <w:tab w:val="left" w:pos="916"/>
+          <w:tab w:val="left" w:pos="1832"/>
+          <w:tab w:val="left" w:pos="2748"/>
+          <w:tab w:val="left" w:pos="3664"/>
+          <w:tab w:val="left" w:pos="4580"/>
+          <w:tab w:val="left" w:pos="5496"/>
+          <w:tab w:val="left" w:pos="6412"/>
+          <w:tab w:val="left" w:pos="7328"/>
+          <w:tab w:val="left" w:pos="8244"/>
+          <w:tab w:val="left" w:pos="9160"/>
+          <w:tab w:val="left" w:pos="10076"/>
+          <w:tab w:val="left" w:pos="10992"/>
+          <w:tab w:val="left" w:pos="11908"/>
+          <w:tab w:val="left" w:pos="12824"/>
+          <w:tab w:val="left" w:pos="13740"/>
+          <w:tab w:val="left" w:pos="14656"/>
+        </w:tabs>
+        <w:spacing w:before="0" w:beforeAutospacing="0" w:after="0" w:afterAutospacing="0"/>
+        <w:divId w:val="1461419437"/>
+        <w:rPr>
+          <w:rFonts w:ascii="Consolas" w:hAnsi="Consolas" w:cs="Courier New"/>
+          <w:sz w:val="17"/>
+          <w:szCs w:val="17"/>
+        </w:rPr>
+      </w:pPr>
+      <w:r>
+        <w:rPr>
+          <w:rFonts w:ascii="Consolas" w:hAnsi="Consolas" w:cs="Courier New"/>
+          <w:sz w:val="17"/>
+          <w:szCs w:val="17"/>
+        </w:rPr>
+        <w:t xml:space="preserve">12. </w:t>
+      </w:r>
+      <w:r>
+        <w:rPr>
+          <w:rFonts w:ascii="Consolas" w:hAnsi="Consolas" w:cs="Courier New"/>
+          <w:color w:val="000000"/>
+          <w:sz w:val="17"/>
+          <w:szCs w:val="17"/>
+        </w:rPr>
+        <w:t xml:space="preserve">    </w:t>
+      </w:r>
+      <w:proofErr w:type="spellStart"/>
+      <w:r>
+        <w:rPr>
+          <w:rFonts w:ascii="Consolas" w:hAnsi="Consolas" w:cs="Courier New"/>
+          <w:color w:val="000000"/>
+          <w:sz w:val="17"/>
+          <w:szCs w:val="17"/>
+        </w:rPr>
+        <w:t>SDL_</w:t>
+      </w:r>
+      <w:proofErr w:type="gramStart"/>
+      <w:r>
+        <w:rPr>
+          <w:rFonts w:ascii="Consolas" w:hAnsi="Consolas" w:cs="Courier New"/>
+          <w:color w:val="000000"/>
+          <w:sz w:val="17"/>
+          <w:szCs w:val="17"/>
+        </w:rPr>
+        <w:t>RenderDrawRect</w:t>
+      </w:r>
+      <w:proofErr w:type="spellEnd"/>
+      <w:r>
+        <w:rPr>
+          <w:rFonts w:ascii="Consolas" w:hAnsi="Consolas" w:cs="Courier New"/>
+          <w:color w:val="666600"/>
+          <w:sz w:val="17"/>
+          <w:szCs w:val="17"/>
+        </w:rPr>
+        <w:t>(</w:t>
+      </w:r>
+      <w:r>
+        <w:rPr>
+          <w:rFonts w:ascii="Consolas" w:hAnsi="Consolas" w:cs="Courier New"/>
+          <w:color w:val="660066"/>
+          <w:sz w:val="17"/>
+          <w:szCs w:val="17"/>
+        </w:rPr>
+        <w:t>Engine</w:t>
+      </w:r>
+      <w:r>
+        <w:rPr>
+          <w:rFonts w:ascii="Consolas" w:hAnsi="Consolas" w:cs="Courier New"/>
+          <w:color w:val="666600"/>
+          <w:sz w:val="17"/>
+          <w:szCs w:val="17"/>
+        </w:rPr>
+        <w:t>::</w:t>
+      </w:r>
+      <w:proofErr w:type="spellStart"/>
+      <w:proofErr w:type="gramEnd"/>
+      <w:r>
+        <w:rPr>
+          <w:rFonts w:ascii="Consolas" w:hAnsi="Consolas" w:cs="Courier New"/>
+          <w:color w:val="660066"/>
+          <w:sz w:val="17"/>
+          <w:szCs w:val="17"/>
+        </w:rPr>
+        <w:t>GetInstance</w:t>
+      </w:r>
+      <w:proofErr w:type="spellEnd"/>
+      <w:r>
+        <w:rPr>
+          <w:rFonts w:ascii="Consolas" w:hAnsi="Consolas" w:cs="Courier New"/>
+          <w:color w:val="666600"/>
+          <w:sz w:val="17"/>
+          <w:szCs w:val="17"/>
+        </w:rPr>
+        <w:t>()-&gt;</w:t>
+      </w:r>
+      <w:proofErr w:type="spellStart"/>
+      <w:proofErr w:type="gramStart"/>
+      <w:r>
+        <w:rPr>
+          <w:rFonts w:ascii="Consolas" w:hAnsi="Consolas" w:cs="Courier New"/>
+          <w:color w:val="660066"/>
+          <w:sz w:val="17"/>
+          <w:szCs w:val="17"/>
+        </w:rPr>
+        <w:t>GetRenderer</w:t>
+      </w:r>
+      <w:proofErr w:type="spellEnd"/>
+      <w:r>
+        <w:rPr>
+          <w:rFonts w:ascii="Consolas" w:hAnsi="Consolas" w:cs="Courier New"/>
+          <w:color w:val="666600"/>
+          <w:sz w:val="17"/>
+          <w:szCs w:val="17"/>
+        </w:rPr>
+        <w:t>(</w:t>
+      </w:r>
+      <w:proofErr w:type="gramEnd"/>
+      <w:r>
+        <w:rPr>
+          <w:rFonts w:ascii="Consolas" w:hAnsi="Consolas" w:cs="Courier New"/>
+          <w:color w:val="666600"/>
+          <w:sz w:val="17"/>
+          <w:szCs w:val="17"/>
+        </w:rPr>
+        <w:t>),</w:t>
+      </w:r>
+      <w:r>
+        <w:rPr>
+          <w:rFonts w:ascii="Consolas" w:hAnsi="Consolas" w:cs="Courier New"/>
+          <w:color w:val="000000"/>
+          <w:sz w:val="17"/>
+          <w:szCs w:val="17"/>
+        </w:rPr>
+        <w:t xml:space="preserve"> </w:t>
+      </w:r>
+      <w:r>
+        <w:rPr>
+          <w:rFonts w:ascii="Consolas" w:hAnsi="Consolas" w:cs="Courier New"/>
+          <w:color w:val="666600"/>
+          <w:sz w:val="17"/>
+          <w:szCs w:val="17"/>
+        </w:rPr>
+        <w:t>&amp;</w:t>
+      </w:r>
+      <w:r>
+        <w:rPr>
+          <w:rFonts w:ascii="Consolas" w:hAnsi="Consolas" w:cs="Courier New"/>
+          <w:color w:val="000000"/>
+          <w:sz w:val="17"/>
+          <w:szCs w:val="17"/>
+        </w:rPr>
+        <w:t>box</w:t>
+      </w:r>
+      <w:proofErr w:type="gramStart"/>
+      <w:r>
+        <w:rPr>
+          <w:rFonts w:ascii="Consolas" w:hAnsi="Consolas" w:cs="Courier New"/>
+          <w:color w:val="666600"/>
+          <w:sz w:val="17"/>
+          <w:szCs w:val="17"/>
+        </w:rPr>
+        <w:t>);</w:t>
+      </w:r>
+      <w:proofErr w:type="gramEnd"/>
+    </w:p>
+    <w:p>
+      <w:pPr>
+        <w:pStyle w:val="NormalWeb"/>
+        <w:pBdr>
+          <w:top w:val="single" w:sz="6" w:space="2" w:color="888888"/>
+          <w:left w:val="single" w:sz="6" w:space="2" w:color="888888"/>
+          <w:bottom w:val="single" w:sz="6" w:space="2" w:color="888888"/>
+          <w:right w:val="single" w:sz="6" w:space="2" w:color="888888"/>
+        </w:pBdr>
+        <w:tabs>
+          <w:tab w:val="left" w:pos="916"/>
+          <w:tab w:val="left" w:pos="1832"/>
+          <w:tab w:val="left" w:pos="2748"/>
+          <w:tab w:val="left" w:pos="3664"/>
+          <w:tab w:val="left" w:pos="4580"/>
+          <w:tab w:val="left" w:pos="5496"/>
+          <w:tab w:val="left" w:pos="6412"/>
+          <w:tab w:val="left" w:pos="7328"/>
+          <w:tab w:val="left" w:pos="8244"/>
+          <w:tab w:val="left" w:pos="9160"/>
+          <w:tab w:val="left" w:pos="10076"/>
+          <w:tab w:val="left" w:pos="10992"/>
+          <w:tab w:val="left" w:pos="11908"/>
+          <w:tab w:val="left" w:pos="12824"/>
+          <w:tab w:val="left" w:pos="13740"/>
+          <w:tab w:val="left" w:pos="14656"/>
+        </w:tabs>
+        <w:spacing w:before="0" w:beforeAutospacing="0" w:after="0" w:afterAutospacing="0"/>
+        <w:divId w:val="1461419437"/>
+        <w:rPr>
+          <w:rFonts w:ascii="Consolas" w:hAnsi="Consolas" w:cs="Courier New"/>
+          <w:sz w:val="17"/>
+          <w:szCs w:val="17"/>
+        </w:rPr>
+      </w:pPr>
+      <w:proofErr w:type="gramStart"/>
+      <w:r>
+        <w:rPr>
+          <w:rFonts w:ascii="Consolas" w:hAnsi="Consolas" w:cs="Courier New"/>
+          <w:sz w:val="17"/>
+          <w:szCs w:val="17"/>
+        </w:rPr>
+        <w:t xml:space="preserve">13. </w:t>
+      </w:r>
+      <w:r>
+        <w:rPr>
+          <w:rFonts w:ascii="Consolas" w:hAnsi="Consolas" w:cs="Courier New"/>
+          <w:color w:val="666600"/>
+          <w:sz w:val="17"/>
+          <w:szCs w:val="17"/>
+        </w:rPr>
+        <w:t>}</w:t>
+      </w:r>
+      <w:proofErr w:type="gramEnd"/>
+    </w:p>
+    <w:p/>
+    <w:p>
+      <w:r>
+        <w:t xml:space="preserve">The only line that was there before was line 3. </w:t>
+      </w:r>
+    </w:p>
+    <w:p>
+      <w:r>
+        <w:t xml:space="preserve">Note: </w:t>
+      </w:r>
+      <w:proofErr w:type="gramStart"/>
+      <w:r>
+        <w:t>In order to</w:t>
+      </w:r>
+      <w:proofErr w:type="gramEnd"/>
+      <w:r>
+        <w:t xml:space="preserve"> compile, you may have to add the following includes:</w:t>
+      </w:r>
+    </w:p>
+    <w:p>
+      <w:pPr>
+        <w:pStyle w:val="NormalWeb"/>
+        <w:pBdr>
+          <w:top w:val="single" w:sz="6" w:space="2" w:color="888888"/>
+          <w:left w:val="single" w:sz="6" w:space="2" w:color="888888"/>
+          <w:bottom w:val="single" w:sz="6" w:space="2" w:color="888888"/>
+          <w:right w:val="single" w:sz="6" w:space="2" w:color="888888"/>
+        </w:pBdr>
+        <w:tabs>
+          <w:tab w:val="left" w:pos="916"/>
+          <w:tab w:val="left" w:pos="1832"/>
+          <w:tab w:val="left" w:pos="2748"/>
+          <w:tab w:val="left" w:pos="3664"/>
+          <w:tab w:val="left" w:pos="4580"/>
+          <w:tab w:val="left" w:pos="5496"/>
+          <w:tab w:val="left" w:pos="6412"/>
+          <w:tab w:val="left" w:pos="7328"/>
+          <w:tab w:val="left" w:pos="8244"/>
+          <w:tab w:val="left" w:pos="9160"/>
+          <w:tab w:val="left" w:pos="10076"/>
+          <w:tab w:val="left" w:pos="10992"/>
+          <w:tab w:val="left" w:pos="11908"/>
+          <w:tab w:val="left" w:pos="12824"/>
+          <w:tab w:val="left" w:pos="13740"/>
+          <w:tab w:val="left" w:pos="14656"/>
+        </w:tabs>
+        <w:spacing w:before="0" w:beforeAutospacing="0" w:after="0" w:afterAutospacing="0"/>
+        <w:divId w:val="2095976398"/>
+        <w:rPr>
+          <w:rFonts w:ascii="Consolas" w:hAnsi="Consolas" w:cs="Courier New"/>
+          <w:sz w:val="17"/>
+          <w:szCs w:val="17"/>
+        </w:rPr>
+      </w:pPr>
+      <w:r>
+        <w:rPr>
+          <w:rFonts w:ascii="Consolas" w:hAnsi="Consolas" w:cs="Courier New"/>
+          <w:sz w:val="17"/>
+          <w:szCs w:val="17"/>
+        </w:rPr>
+        <w:t xml:space="preserve">1. </w:t>
+      </w:r>
+      <w:r>
+        <w:rPr>
+          <w:rFonts w:ascii="Consolas" w:hAnsi="Consolas" w:cs="Courier New"/>
+          <w:color w:val="880000"/>
+          <w:sz w:val="17"/>
+          <w:szCs w:val="17"/>
+        </w:rPr>
+        <w:t>#include</w:t>
+      </w:r>
+      <w:r>
+        <w:rPr>
+          <w:rFonts w:ascii="Consolas" w:hAnsi="Consolas" w:cs="Courier New"/>
+          <w:color w:val="000000"/>
+          <w:sz w:val="17"/>
+          <w:szCs w:val="17"/>
+        </w:rPr>
+        <w:t xml:space="preserve"> </w:t>
+      </w:r>
+      <w:r>
+        <w:rPr>
+          <w:rFonts w:ascii="Consolas" w:hAnsi="Consolas" w:cs="Courier New"/>
+          <w:color w:val="008800"/>
+          <w:sz w:val="17"/>
+          <w:szCs w:val="17"/>
+        </w:rPr>
+        <w:t>"</w:t>
+      </w:r>
+      <w:proofErr w:type="spellStart"/>
+      <w:r>
+        <w:rPr>
+          <w:rFonts w:ascii="Consolas" w:hAnsi="Consolas" w:cs="Courier New"/>
+          <w:color w:val="008800"/>
+          <w:sz w:val="17"/>
+          <w:szCs w:val="17"/>
+        </w:rPr>
+        <w:t>Camera.h</w:t>
+      </w:r>
+      <w:proofErr w:type="spellEnd"/>
+      <w:r>
+        <w:rPr>
+          <w:rFonts w:ascii="Consolas" w:hAnsi="Consolas" w:cs="Courier New"/>
+          <w:color w:val="008800"/>
+          <w:sz w:val="17"/>
+          <w:szCs w:val="17"/>
+        </w:rPr>
+        <w:t>"</w:t>
+      </w:r>
+    </w:p>
+    <w:p>
+      <w:pPr>
+        <w:pStyle w:val="NormalWeb"/>
+        <w:pBdr>
+          <w:top w:val="single" w:sz="6" w:space="2" w:color="888888"/>
+          <w:left w:val="single" w:sz="6" w:space="2" w:color="888888"/>
+          <w:bottom w:val="single" w:sz="6" w:space="2" w:color="888888"/>
+          <w:right w:val="single" w:sz="6" w:space="2" w:color="888888"/>
+        </w:pBdr>
+        <w:tabs>
+          <w:tab w:val="left" w:pos="916"/>
+          <w:tab w:val="left" w:pos="1832"/>
+          <w:tab w:val="left" w:pos="2748"/>
+          <w:tab w:val="left" w:pos="3664"/>
+          <w:tab w:val="left" w:pos="4580"/>
+          <w:tab w:val="left" w:pos="5496"/>
+          <w:tab w:val="left" w:pos="6412"/>
+          <w:tab w:val="left" w:pos="7328"/>
+          <w:tab w:val="left" w:pos="8244"/>
+          <w:tab w:val="left" w:pos="9160"/>
+          <w:tab w:val="left" w:pos="10076"/>
+          <w:tab w:val="left" w:pos="10992"/>
+          <w:tab w:val="left" w:pos="11908"/>
+          <w:tab w:val="left" w:pos="12824"/>
+          <w:tab w:val="left" w:pos="13740"/>
+          <w:tab w:val="left" w:pos="14656"/>
+        </w:tabs>
+        <w:spacing w:before="0" w:beforeAutospacing="0" w:after="0" w:afterAutospacing="0"/>
+        <w:divId w:val="2095976398"/>
+        <w:rPr>
+          <w:rFonts w:ascii="Consolas" w:hAnsi="Consolas" w:cs="Courier New"/>
+          <w:sz w:val="17"/>
+          <w:szCs w:val="17"/>
+        </w:rPr>
+      </w:pPr>
+      <w:r>
+        <w:rPr>
+          <w:rFonts w:ascii="Consolas" w:hAnsi="Consolas" w:cs="Courier New"/>
+          <w:sz w:val="17"/>
+          <w:szCs w:val="17"/>
+        </w:rPr>
+        <w:t xml:space="preserve">2. </w:t>
+      </w:r>
+      <w:r>
+        <w:rPr>
+          <w:rFonts w:ascii="Consolas" w:hAnsi="Consolas" w:cs="Courier New"/>
+          <w:color w:val="880000"/>
+          <w:sz w:val="17"/>
+          <w:szCs w:val="17"/>
+        </w:rPr>
+        <w:t>#include</w:t>
+      </w:r>
+      <w:r>
+        <w:rPr>
+          <w:rFonts w:ascii="Consolas" w:hAnsi="Consolas" w:cs="Courier New"/>
+          <w:color w:val="000000"/>
+          <w:sz w:val="17"/>
+          <w:szCs w:val="17"/>
+        </w:rPr>
+        <w:t xml:space="preserve"> </w:t>
+      </w:r>
+      <w:r>
+        <w:rPr>
+          <w:rFonts w:ascii="Consolas" w:hAnsi="Consolas" w:cs="Courier New"/>
+          <w:color w:val="008800"/>
+          <w:sz w:val="17"/>
+          <w:szCs w:val="17"/>
+        </w:rPr>
+        <w:t>"</w:t>
+      </w:r>
+      <w:proofErr w:type="spellStart"/>
+      <w:r>
+        <w:rPr>
+          <w:rFonts w:ascii="Consolas" w:hAnsi="Consolas" w:cs="Courier New"/>
+          <w:color w:val="008800"/>
+          <w:sz w:val="17"/>
+          <w:szCs w:val="17"/>
+        </w:rPr>
+        <w:t>Engine.h</w:t>
+      </w:r>
+      <w:proofErr w:type="spellEnd"/>
+      <w:r>
+        <w:rPr>
+          <w:rFonts w:ascii="Consolas" w:hAnsi="Consolas" w:cs="Courier New"/>
+          <w:color w:val="008800"/>
+          <w:sz w:val="17"/>
+          <w:szCs w:val="17"/>
+        </w:rPr>
+        <w:t>"</w:t>
+      </w:r>
+    </w:p>
+    <w:p/>
     <w:p/>
     <w:p/>
     <w:p/>
@@ -36544,6 +40171,119 @@
     </w:lvl>
   </w:abstractNum>
   <w:abstractNum w:abstractNumId="101" w15:restartNumberingAfterBreak="0">
+    <w:nsid w:val="74220C81"/>
+    <w:multiLevelType w:val="hybridMultilevel"/>
+    <w:tmpl w:val="8A5C8956"/>
+    <w:lvl w:ilvl="0" w:tplc="04090001">
+      <w:start w:val="1"/>
+      <w:numFmt w:val="bullet"/>
+      <w:lvlText w:val=""/>
+      <w:lvlJc w:val="left"/>
+      <w:pPr>
+        <w:ind w:left="720" w:hanging="360"/>
+      </w:pPr>
+      <w:rPr>
+        <w:rFonts w:ascii="Symbol" w:hAnsi="Symbol" w:hint="default"/>
+      </w:rPr>
+    </w:lvl>
+    <w:lvl w:ilvl="1" w:tplc="04090003" w:tentative="1">
+      <w:start w:val="1"/>
+      <w:numFmt w:val="bullet"/>
+      <w:lvlText w:val="o"/>
+      <w:lvlJc w:val="left"/>
+      <w:pPr>
+        <w:ind w:left="1440" w:hanging="360"/>
+      </w:pPr>
+      <w:rPr>
+        <w:rFonts w:ascii="Courier New" w:hAnsi="Courier New" w:cs="Courier New" w:hint="default"/>
+      </w:rPr>
+    </w:lvl>
+    <w:lvl w:ilvl="2" w:tplc="04090005" w:tentative="1">
+      <w:start w:val="1"/>
+      <w:numFmt w:val="bullet"/>
+      <w:lvlText w:val=""/>
+      <w:lvlJc w:val="left"/>
+      <w:pPr>
+        <w:ind w:left="2160" w:hanging="360"/>
+      </w:pPr>
+      <w:rPr>
+        <w:rFonts w:ascii="Wingdings" w:hAnsi="Wingdings" w:hint="default"/>
+      </w:rPr>
+    </w:lvl>
+    <w:lvl w:ilvl="3" w:tplc="04090001" w:tentative="1">
+      <w:start w:val="1"/>
+      <w:numFmt w:val="bullet"/>
+      <w:lvlText w:val=""/>
+      <w:lvlJc w:val="left"/>
+      <w:pPr>
+        <w:ind w:left="2880" w:hanging="360"/>
+      </w:pPr>
+      <w:rPr>
+        <w:rFonts w:ascii="Symbol" w:hAnsi="Symbol" w:hint="default"/>
+      </w:rPr>
+    </w:lvl>
+    <w:lvl w:ilvl="4" w:tplc="04090003" w:tentative="1">
+      <w:start w:val="1"/>
+      <w:numFmt w:val="bullet"/>
+      <w:lvlText w:val="o"/>
+      <w:lvlJc w:val="left"/>
+      <w:pPr>
+        <w:ind w:left="3600" w:hanging="360"/>
+      </w:pPr>
+      <w:rPr>
+        <w:rFonts w:ascii="Courier New" w:hAnsi="Courier New" w:cs="Courier New" w:hint="default"/>
+      </w:rPr>
+    </w:lvl>
+    <w:lvl w:ilvl="5" w:tplc="04090005" w:tentative="1">
+      <w:start w:val="1"/>
+      <w:numFmt w:val="bullet"/>
+      <w:lvlText w:val=""/>
+      <w:lvlJc w:val="left"/>
+      <w:pPr>
+        <w:ind w:left="4320" w:hanging="360"/>
+      </w:pPr>
+      <w:rPr>
+        <w:rFonts w:ascii="Wingdings" w:hAnsi="Wingdings" w:hint="default"/>
+      </w:rPr>
+    </w:lvl>
+    <w:lvl w:ilvl="6" w:tplc="04090001" w:tentative="1">
+      <w:start w:val="1"/>
+      <w:numFmt w:val="bullet"/>
+      <w:lvlText w:val=""/>
+      <w:lvlJc w:val="left"/>
+      <w:pPr>
+        <w:ind w:left="5040" w:hanging="360"/>
+      </w:pPr>
+      <w:rPr>
+        <w:rFonts w:ascii="Symbol" w:hAnsi="Symbol" w:hint="default"/>
+      </w:rPr>
+    </w:lvl>
+    <w:lvl w:ilvl="7" w:tplc="04090003" w:tentative="1">
+      <w:start w:val="1"/>
+      <w:numFmt w:val="bullet"/>
+      <w:lvlText w:val="o"/>
+      <w:lvlJc w:val="left"/>
+      <w:pPr>
+        <w:ind w:left="5760" w:hanging="360"/>
+      </w:pPr>
+      <w:rPr>
+        <w:rFonts w:ascii="Courier New" w:hAnsi="Courier New" w:cs="Courier New" w:hint="default"/>
+      </w:rPr>
+    </w:lvl>
+    <w:lvl w:ilvl="8" w:tplc="04090005" w:tentative="1">
+      <w:start w:val="1"/>
+      <w:numFmt w:val="bullet"/>
+      <w:lvlText w:val=""/>
+      <w:lvlJc w:val="left"/>
+      <w:pPr>
+        <w:ind w:left="6480" w:hanging="360"/>
+      </w:pPr>
+      <w:rPr>
+        <w:rFonts w:ascii="Wingdings" w:hAnsi="Wingdings" w:hint="default"/>
+      </w:rPr>
+    </w:lvl>
+  </w:abstractNum>
+  <w:abstractNum w:abstractNumId="102" w15:restartNumberingAfterBreak="0">
     <w:nsid w:val="743F7800"/>
     <w:multiLevelType w:val="hybridMultilevel"/>
     <w:tmpl w:val="EB4A3D32"/>
@@ -36656,7 +40396,7 @@
       </w:rPr>
     </w:lvl>
   </w:abstractNum>
-  <w:abstractNum w:abstractNumId="102" w15:restartNumberingAfterBreak="0">
+  <w:abstractNum w:abstractNumId="103" w15:restartNumberingAfterBreak="0">
     <w:nsid w:val="764F73DF"/>
     <w:multiLevelType w:val="hybridMultilevel"/>
     <w:tmpl w:val="07163712"/>
@@ -36769,7 +40509,7 @@
       </w:rPr>
     </w:lvl>
   </w:abstractNum>
-  <w:abstractNum w:abstractNumId="103" w15:restartNumberingAfterBreak="0">
+  <w:abstractNum w:abstractNumId="104" w15:restartNumberingAfterBreak="0">
     <w:nsid w:val="76A974CC"/>
     <w:multiLevelType w:val="hybridMultilevel"/>
     <w:tmpl w:val="1E923978"/>
@@ -36882,7 +40622,7 @@
       </w:rPr>
     </w:lvl>
   </w:abstractNum>
-  <w:abstractNum w:abstractNumId="104" w15:restartNumberingAfterBreak="0">
+  <w:abstractNum w:abstractNumId="105" w15:restartNumberingAfterBreak="0">
     <w:nsid w:val="772F0B4B"/>
     <w:multiLevelType w:val="hybridMultilevel"/>
     <w:tmpl w:val="37225E84"/>
@@ -36995,7 +40735,7 @@
       </w:rPr>
     </w:lvl>
   </w:abstractNum>
-  <w:abstractNum w:abstractNumId="105" w15:restartNumberingAfterBreak="0">
+  <w:abstractNum w:abstractNumId="106" w15:restartNumberingAfterBreak="0">
     <w:nsid w:val="774612A6"/>
     <w:multiLevelType w:val="multilevel"/>
     <w:tmpl w:val="2F5E832C"/>
@@ -37144,7 +40884,7 @@
       </w:rPr>
     </w:lvl>
   </w:abstractNum>
-  <w:abstractNum w:abstractNumId="106" w15:restartNumberingAfterBreak="0">
+  <w:abstractNum w:abstractNumId="107" w15:restartNumberingAfterBreak="0">
     <w:nsid w:val="77D56A74"/>
     <w:multiLevelType w:val="hybridMultilevel"/>
     <w:tmpl w:val="6EBEDCE0"/>
@@ -37257,7 +40997,7 @@
       </w:rPr>
     </w:lvl>
   </w:abstractNum>
-  <w:abstractNum w:abstractNumId="107" w15:restartNumberingAfterBreak="0">
+  <w:abstractNum w:abstractNumId="108" w15:restartNumberingAfterBreak="0">
     <w:nsid w:val="78510685"/>
     <w:multiLevelType w:val="hybridMultilevel"/>
     <w:tmpl w:val="AACCE9C2"/>
@@ -37370,7 +41110,7 @@
       </w:rPr>
     </w:lvl>
   </w:abstractNum>
-  <w:abstractNum w:abstractNumId="108" w15:restartNumberingAfterBreak="0">
+  <w:abstractNum w:abstractNumId="109" w15:restartNumberingAfterBreak="0">
     <w:nsid w:val="78FE71A3"/>
     <w:multiLevelType w:val="multilevel"/>
     <w:tmpl w:val="8020EE14"/>
@@ -37487,7 +41227,7 @@
       </w:pPr>
     </w:lvl>
   </w:abstractNum>
-  <w:abstractNum w:abstractNumId="109" w15:restartNumberingAfterBreak="0">
+  <w:abstractNum w:abstractNumId="110" w15:restartNumberingAfterBreak="0">
     <w:nsid w:val="790E64F4"/>
     <w:multiLevelType w:val="multilevel"/>
     <w:tmpl w:val="68B0B0BA"/>
@@ -37636,7 +41376,7 @@
       </w:rPr>
     </w:lvl>
   </w:abstractNum>
-  <w:abstractNum w:abstractNumId="110" w15:restartNumberingAfterBreak="0">
+  <w:abstractNum w:abstractNumId="111" w15:restartNumberingAfterBreak="0">
     <w:nsid w:val="7A0021DF"/>
     <w:multiLevelType w:val="multilevel"/>
     <w:tmpl w:val="66EC03CC"/>
@@ -37749,7 +41489,7 @@
       </w:pPr>
     </w:lvl>
   </w:abstractNum>
-  <w:abstractNum w:abstractNumId="111" w15:restartNumberingAfterBreak="0">
+  <w:abstractNum w:abstractNumId="112" w15:restartNumberingAfterBreak="0">
     <w:nsid w:val="7A945B17"/>
     <w:multiLevelType w:val="hybridMultilevel"/>
     <w:tmpl w:val="92322E56"/>
@@ -37862,7 +41602,7 @@
       </w:rPr>
     </w:lvl>
   </w:abstractNum>
-  <w:abstractNum w:abstractNumId="112" w15:restartNumberingAfterBreak="0">
+  <w:abstractNum w:abstractNumId="113" w15:restartNumberingAfterBreak="0">
     <w:nsid w:val="7AF56AF4"/>
     <w:multiLevelType w:val="hybridMultilevel"/>
     <w:tmpl w:val="EA68502E"/>
@@ -37975,7 +41715,7 @@
       </w:rPr>
     </w:lvl>
   </w:abstractNum>
-  <w:abstractNum w:abstractNumId="113" w15:restartNumberingAfterBreak="0">
+  <w:abstractNum w:abstractNumId="114" w15:restartNumberingAfterBreak="0">
     <w:nsid w:val="7C9655CE"/>
     <w:multiLevelType w:val="multilevel"/>
     <w:tmpl w:val="2D6E5DEA"/>
@@ -38124,7 +41864,7 @@
       </w:rPr>
     </w:lvl>
   </w:abstractNum>
-  <w:abstractNum w:abstractNumId="114" w15:restartNumberingAfterBreak="0">
+  <w:abstractNum w:abstractNumId="115" w15:restartNumberingAfterBreak="0">
     <w:nsid w:val="7FD56A97"/>
     <w:multiLevelType w:val="hybridMultilevel"/>
     <w:tmpl w:val="EE40A03E"/>
@@ -38237,7 +41977,7 @@
       </w:rPr>
     </w:lvl>
   </w:abstractNum>
-  <w:abstractNum w:abstractNumId="115" w15:restartNumberingAfterBreak="0">
+  <w:abstractNum w:abstractNumId="116" w15:restartNumberingAfterBreak="0">
     <w:nsid w:val="7FEC477F"/>
     <w:multiLevelType w:val="hybridMultilevel"/>
     <w:tmpl w:val="28824920"/>
@@ -38360,7 +42100,7 @@
     <w:abstractNumId w:val="62"/>
   </w:num>
   <w:num w:numId="4" w16cid:durableId="1664041010">
-    <w:abstractNumId w:val="103"/>
+    <w:abstractNumId w:val="104"/>
   </w:num>
   <w:num w:numId="5" w16cid:durableId="921379253">
     <w:abstractNumId w:val="87"/>
@@ -38372,7 +42112,7 @@
     <w:abstractNumId w:val="75"/>
   </w:num>
   <w:num w:numId="8" w16cid:durableId="1956058566">
-    <w:abstractNumId w:val="111"/>
+    <w:abstractNumId w:val="112"/>
   </w:num>
   <w:num w:numId="9" w16cid:durableId="348217591">
     <w:abstractNumId w:val="40"/>
@@ -38387,7 +42127,7 @@
     <w:abstractNumId w:val="93"/>
   </w:num>
   <w:num w:numId="13" w16cid:durableId="80372572">
-    <w:abstractNumId w:val="114"/>
+    <w:abstractNumId w:val="115"/>
   </w:num>
   <w:num w:numId="14" w16cid:durableId="745343068">
     <w:abstractNumId w:val="82"/>
@@ -38498,13 +42238,13 @@
     <w:abstractNumId w:val="25"/>
   </w:num>
   <w:num w:numId="50" w16cid:durableId="43676436">
-    <w:abstractNumId w:val="108"/>
+    <w:abstractNumId w:val="109"/>
   </w:num>
   <w:num w:numId="51" w16cid:durableId="37510062">
     <w:abstractNumId w:val="45"/>
   </w:num>
   <w:num w:numId="52" w16cid:durableId="1265069299">
-    <w:abstractNumId w:val="104"/>
+    <w:abstractNumId w:val="105"/>
   </w:num>
   <w:num w:numId="53" w16cid:durableId="923294543">
     <w:abstractNumId w:val="26"/>
@@ -38522,7 +42262,7 @@
     <w:abstractNumId w:val="42"/>
   </w:num>
   <w:num w:numId="58" w16cid:durableId="96408706">
-    <w:abstractNumId w:val="110"/>
+    <w:abstractNumId w:val="111"/>
   </w:num>
   <w:num w:numId="59" w16cid:durableId="1535578131">
     <w:abstractNumId w:val="97"/>
@@ -38537,7 +42277,7 @@
     <w:abstractNumId w:val="74"/>
   </w:num>
   <w:num w:numId="63" w16cid:durableId="1288586020">
-    <w:abstractNumId w:val="105"/>
+    <w:abstractNumId w:val="106"/>
   </w:num>
   <w:num w:numId="64" w16cid:durableId="2062708937">
     <w:abstractNumId w:val="32"/>
@@ -38555,10 +42295,10 @@
     <w:abstractNumId w:val="95"/>
   </w:num>
   <w:num w:numId="69" w16cid:durableId="2077781018">
-    <w:abstractNumId w:val="102"/>
+    <w:abstractNumId w:val="103"/>
   </w:num>
   <w:num w:numId="70" w16cid:durableId="1052656788">
-    <w:abstractNumId w:val="109"/>
+    <w:abstractNumId w:val="110"/>
   </w:num>
   <w:num w:numId="71" w16cid:durableId="1298879861">
     <w:abstractNumId w:val="41"/>
@@ -38567,7 +42307,7 @@
     <w:abstractNumId w:val="59"/>
   </w:num>
   <w:num w:numId="73" w16cid:durableId="1914585088">
-    <w:abstractNumId w:val="101"/>
+    <w:abstractNumId w:val="102"/>
   </w:num>
   <w:num w:numId="74" w16cid:durableId="364644140">
     <w:abstractNumId w:val="100"/>
@@ -38803,13 +42543,13 @@
     <w:abstractNumId w:val="68"/>
   </w:num>
   <w:num w:numId="95" w16cid:durableId="878277793">
-    <w:abstractNumId w:val="113"/>
+    <w:abstractNumId w:val="114"/>
   </w:num>
   <w:num w:numId="96" w16cid:durableId="1704330917">
     <w:abstractNumId w:val="86"/>
   </w:num>
   <w:num w:numId="97" w16cid:durableId="1008823346">
-    <w:abstractNumId w:val="107"/>
+    <w:abstractNumId w:val="108"/>
   </w:num>
   <w:num w:numId="98" w16cid:durableId="1376007719">
     <w:abstractNumId w:val="50"/>
@@ -38836,7 +42576,7 @@
     <w:abstractNumId w:val="48"/>
   </w:num>
   <w:num w:numId="106" w16cid:durableId="286132080">
-    <w:abstractNumId w:val="106"/>
+    <w:abstractNumId w:val="107"/>
   </w:num>
   <w:num w:numId="107" w16cid:durableId="968903110">
     <w:abstractNumId w:val="6"/>
@@ -38848,7 +42588,7 @@
     <w:abstractNumId w:val="92"/>
   </w:num>
   <w:num w:numId="110" w16cid:durableId="251621159">
-    <w:abstractNumId w:val="115"/>
+    <w:abstractNumId w:val="116"/>
   </w:num>
   <w:num w:numId="111" w16cid:durableId="1824472230">
     <w:abstractNumId w:val="37"/>
@@ -38887,7 +42627,7 @@
     <w:abstractNumId w:val="20"/>
   </w:num>
   <w:num w:numId="123" w16cid:durableId="1937398986">
-    <w:abstractNumId w:val="112"/>
+    <w:abstractNumId w:val="113"/>
   </w:num>
   <w:num w:numId="124" w16cid:durableId="1756243905">
     <w:abstractNumId w:val="71"/>
@@ -38897,6 +42637,9 @@
   </w:num>
   <w:num w:numId="126" w16cid:durableId="349797458">
     <w:abstractNumId w:val="22"/>
+  </w:num>
+  <w:num w:numId="127" w16cid:durableId="849566688">
+    <w:abstractNumId w:val="101"/>
   </w:num>
   <w:numIdMacAtCleanup w:val="117"/>
 </w:numbering>

</xml_diff>